<commit_message>
Correct two Sharda faculty links; restore Saptadeepa Kalita's real photo
Your edits fix the two profile URLs that were redirecting to a generic
page: saptadeepa-kalita is listed under ms-, and sushant-jhingran without
the dr- prefix. Both now resolve to the right people.

That also makes Dr. Saptadeepa Kalita's own portrait reachable, so her card
gets a real photo again instead of the initials fallback it was left with
after the redirect served Dr. Anviti Gupta's photo. Dr. Sushant Jhingran's
corrected page carries no photo, so his card keeps initials.

Co-Authored-By: Claude Opus 5 (1M context) <noreply@anthropic.com>
</commit_message>
<xml_diff>
--- a/assets/downloads/ICNGCI-2027-Conference-Information.docx
+++ b/assets/downloads/ICNGCI-2027-Conference-Information.docx
@@ -7392,20 +7392,6 @@
         <w:t>Honorary Chairs</w:t>
       </w:r>
     </w:p>
-    <w:p>
-      <w:pPr>
-        <w:spacing w:before="0" w:after="80"/>
-      </w:pPr>
-      <w:r>
-        <w:rPr>
-          <w:b w:val="0"/>
-          <w:i w:val="0"/>
-          <w:color w:val="616161"/>
-          <w:sz w:val="19"/>
-        </w:rPr>
-        <w:t>4 confirmed members.</w:t>
-      </w:r>
-    </w:p>
     <w:tbl>
       <w:tblPr>
         <w:tblStyle w:val="TableGrid"/>
@@ -8182,20 +8168,6 @@
         <w:t>International Advisory Committee</w:t>
       </w:r>
     </w:p>
-    <w:p>
-      <w:pPr>
-        <w:spacing w:before="0" w:after="80"/>
-      </w:pPr>
-      <w:r>
-        <w:rPr>
-          <w:b w:val="0"/>
-          <w:i w:val="0"/>
-          <w:color w:val="616161"/>
-          <w:sz w:val="19"/>
-        </w:rPr>
-        <w:t>19 confirmed members.</w:t>
-      </w:r>
-    </w:p>
     <w:tbl>
       <w:tblPr>
         <w:tblStyle w:val="TableGrid"/>
@@ -9116,20 +9088,6 @@
         <w:t>National Advisory Committee</w:t>
       </w:r>
     </w:p>
-    <w:p>
-      <w:pPr>
-        <w:spacing w:before="0" w:after="80"/>
-      </w:pPr>
-      <w:r>
-        <w:rPr>
-          <w:b w:val="0"/>
-          <w:i w:val="0"/>
-          <w:color w:val="616161"/>
-          <w:sz w:val="19"/>
-        </w:rPr>
-        <w:t>Seven positions. Members are published here as appointments are confirmed.</w:t>
-      </w:r>
-    </w:p>
     <w:tbl>
       <w:tblPr>
         <w:tblStyle w:val="TableGrid"/>
@@ -9536,20 +9494,6 @@
         <w:t>Track chairs</w:t>
       </w:r>
     </w:p>
-    <w:p>
-      <w:pPr>
-        <w:spacing w:before="0" w:after="80"/>
-      </w:pPr>
-      <w:r>
-        <w:rPr>
-          <w:b w:val="0"/>
-          <w:i w:val="0"/>
-          <w:color w:val="616161"/>
-          <w:sz w:val="19"/>
-        </w:rPr>
-        <w:t>Each track chair assigns reviewers, moderates the discussion where reviews diverge, and recommends the final decision for every paper in their track.</w:t>
-      </w:r>
-    </w:p>
     <w:tbl>
       <w:tblPr>
         <w:tblStyle w:val="TableGrid"/>
@@ -10460,20 +10404,6 @@
           <w:sz w:val="22"/>
         </w:rPr>
         <w:t>Technical Program Committee members</w:t>
-      </w:r>
-    </w:p>
-    <w:p>
-      <w:pPr>
-        <w:spacing w:before="0" w:after="80"/>
-      </w:pPr>
-      <w:r>
-        <w:rPr>
-          <w:b w:val="0"/>
-          <w:i w:val="0"/>
-          <w:color w:val="616161"/>
-          <w:sz w:val="19"/>
-        </w:rPr>
-        <w:t>11 confirmed members. The panel continues to grow.</w:t>
       </w:r>
     </w:p>
     <w:tbl>

</xml_diff>

<commit_message>
Add Sushant Jhingran's photo; give Geetha Ganesan a Programme Chair slot
Promotes Dr. Geetha Ganesan into her own Programme Chair group alongside
the other leadership roles, and drops the now-duplicate card from the
Organizing panel's Programme Chairs list so she appears once rather than
twice.

Fixes the new photo on the way in: the card pointed at Sushant-Jhingran.jpg
while the file on disk was .jpeg, so the image 404'd. Renamed to the
lowercase .jpg the rest of assets/img/people uses, corrected the declared
dimensions to the real 512x512, and re-encoded it from a fresh canvas to
strip the EXIF block the original carried.

Co-Authored-By: Claude Opus 5 (1M context) <noreply@anthropic.com>
</commit_message>
<xml_diff>
--- a/assets/downloads/ICNGCI-2027-Conference-Information.docx
+++ b/assets/downloads/ICNGCI-2027-Conference-Information.docx
@@ -7777,7 +7777,7 @@
           <w:color w:val="0A0A0A"/>
           <w:sz w:val="22"/>
         </w:rPr>
-        <w:t>Conference Chairs</w:t>
+        <w:t>Programme Chair</w:t>
       </w:r>
     </w:p>
     <w:tbl>
@@ -7855,7 +7855,7 @@
               <w:rPr>
                 <w:sz w:val="18"/>
               </w:rPr>
-              <w:t>Dr. Sudeep Varshney</w:t>
+              <w:t>Dr. Geetha Ganesan</w:t>
             </w:r>
           </w:p>
         </w:tc>
@@ -7869,7 +7869,7 @@
               <w:rPr>
                 <w:sz w:val="18"/>
               </w:rPr>
-              <w:t>Conference Chair · Associate Dean</w:t>
+              <w:t>Programme Chair · Dean</w:t>
             </w:r>
           </w:p>
         </w:tc>
@@ -7884,138 +7884,6 @@
                 <w:sz w:val="18"/>
               </w:rPr>
               <w:t>School of Computing Science and Engineering, Sharda University, Greater Noida, India</w:t>
-            </w:r>
-          </w:p>
-        </w:tc>
-      </w:tr>
-      <w:tr>
-        <w:tc>
-          <w:tcPr>
-            <w:tcW w:type="dxa" w:w="2736"/>
-          </w:tcPr>
-          <w:p>
-            <w:r/>
-            <w:r>
-              <w:rPr>
-                <w:sz w:val="18"/>
-              </w:rPr>
-              <w:t>Dr. K. Batri</w:t>
-            </w:r>
-          </w:p>
-        </w:tc>
-        <w:tc>
-          <w:tcPr>
-            <w:tcW w:type="dxa" w:w="2016"/>
-          </w:tcPr>
-          <w:p>
-            <w:r/>
-            <w:r>
-              <w:rPr>
-                <w:sz w:val="18"/>
-              </w:rPr>
-              <w:t>Conference Chair · Associate Dean</w:t>
-            </w:r>
-          </w:p>
-        </w:tc>
-        <w:tc>
-          <w:tcPr>
-            <w:tcW w:type="dxa" w:w="4752"/>
-          </w:tcPr>
-          <w:p>
-            <w:r/>
-            <w:r>
-              <w:rPr>
-                <w:sz w:val="18"/>
-              </w:rPr>
-              <w:t>School of Computing Science and Engineering, Sharda University, Greater Noida, India</w:t>
-            </w:r>
-          </w:p>
-        </w:tc>
-      </w:tr>
-      <w:tr>
-        <w:tc>
-          <w:tcPr>
-            <w:tcW w:type="dxa" w:w="2736"/>
-          </w:tcPr>
-          <w:p>
-            <w:r/>
-            <w:r>
-              <w:rPr>
-                <w:sz w:val="18"/>
-              </w:rPr>
-              <w:t>Dr. Jayant Sekhar</w:t>
-            </w:r>
-          </w:p>
-        </w:tc>
-        <w:tc>
-          <w:tcPr>
-            <w:tcW w:type="dxa" w:w="2016"/>
-          </w:tcPr>
-          <w:p>
-            <w:r/>
-            <w:r>
-              <w:rPr>
-                <w:sz w:val="18"/>
-              </w:rPr>
-              <w:t>Conference Chair · Head of Department</w:t>
-            </w:r>
-          </w:p>
-        </w:tc>
-        <w:tc>
-          <w:tcPr>
-            <w:tcW w:type="dxa" w:w="4752"/>
-          </w:tcPr>
-          <w:p>
-            <w:r/>
-            <w:r>
-              <w:rPr>
-                <w:sz w:val="18"/>
-              </w:rPr>
-              <w:t>Department of Computer Science and Engineering, SSCSE, Sharda University, Greater Noida, India</w:t>
-            </w:r>
-          </w:p>
-        </w:tc>
-      </w:tr>
-      <w:tr>
-        <w:tc>
-          <w:tcPr>
-            <w:tcW w:type="dxa" w:w="2736"/>
-          </w:tcPr>
-          <w:p>
-            <w:r/>
-            <w:r>
-              <w:rPr>
-                <w:sz w:val="18"/>
-              </w:rPr>
-              <w:t>Dr. Rajneesh Kumar Singh</w:t>
-            </w:r>
-          </w:p>
-        </w:tc>
-        <w:tc>
-          <w:tcPr>
-            <w:tcW w:type="dxa" w:w="2016"/>
-          </w:tcPr>
-          <w:p>
-            <w:r/>
-            <w:r>
-              <w:rPr>
-                <w:sz w:val="18"/>
-              </w:rPr>
-              <w:t>Conference Chair · Head of Department</w:t>
-            </w:r>
-          </w:p>
-        </w:tc>
-        <w:tc>
-          <w:tcPr>
-            <w:tcW w:type="dxa" w:w="4752"/>
-          </w:tcPr>
-          <w:p>
-            <w:r/>
-            <w:r>
-              <w:rPr>
-                <w:sz w:val="18"/>
-              </w:rPr>
-              <w:t>Department of Computer Science and Applications, SSCSE, Sharda University, Greater Noida, India</w:t>
             </w:r>
           </w:p>
         </w:tc>
@@ -8037,7 +7905,7 @@
           <w:color w:val="0A0A0A"/>
           <w:sz w:val="22"/>
         </w:rPr>
-        <w:t>Convener</w:t>
+        <w:t>Conference Chairs</w:t>
       </w:r>
     </w:p>
     <w:tbl>
@@ -8115,7 +7983,7 @@
               <w:rPr>
                 <w:sz w:val="18"/>
               </w:rPr>
-              <w:t>Dr. Bharat Bhushan</w:t>
+              <w:t>Dr. Sudeep Varshney</w:t>
             </w:r>
           </w:p>
         </w:tc>
@@ -8129,7 +7997,7 @@
               <w:rPr>
                 <w:sz w:val="18"/>
               </w:rPr>
-              <w:t>Convener · Associate Professor</w:t>
+              <w:t>Conference Chair · Associate Dean</w:t>
             </w:r>
           </w:p>
         </w:tc>
@@ -8143,7 +8011,139 @@
               <w:rPr>
                 <w:sz w:val="18"/>
               </w:rPr>
+              <w:t>School of Computing Science and Engineering, Sharda University, Greater Noida, India</w:t>
+            </w:r>
+          </w:p>
+        </w:tc>
+      </w:tr>
+      <w:tr>
+        <w:tc>
+          <w:tcPr>
+            <w:tcW w:type="dxa" w:w="2736"/>
+          </w:tcPr>
+          <w:p>
+            <w:r/>
+            <w:r>
+              <w:rPr>
+                <w:sz w:val="18"/>
+              </w:rPr>
+              <w:t>Dr. K. Batri</w:t>
+            </w:r>
+          </w:p>
+        </w:tc>
+        <w:tc>
+          <w:tcPr>
+            <w:tcW w:type="dxa" w:w="2016"/>
+          </w:tcPr>
+          <w:p>
+            <w:r/>
+            <w:r>
+              <w:rPr>
+                <w:sz w:val="18"/>
+              </w:rPr>
+              <w:t>Conference Chair · Associate Dean</w:t>
+            </w:r>
+          </w:p>
+        </w:tc>
+        <w:tc>
+          <w:tcPr>
+            <w:tcW w:type="dxa" w:w="4752"/>
+          </w:tcPr>
+          <w:p>
+            <w:r/>
+            <w:r>
+              <w:rPr>
+                <w:sz w:val="18"/>
+              </w:rPr>
+              <w:t>School of Computing Science and Engineering, Sharda University, Greater Noida, India</w:t>
+            </w:r>
+          </w:p>
+        </w:tc>
+      </w:tr>
+      <w:tr>
+        <w:tc>
+          <w:tcPr>
+            <w:tcW w:type="dxa" w:w="2736"/>
+          </w:tcPr>
+          <w:p>
+            <w:r/>
+            <w:r>
+              <w:rPr>
+                <w:sz w:val="18"/>
+              </w:rPr>
+              <w:t>Dr. Jayant Sekhar</w:t>
+            </w:r>
+          </w:p>
+        </w:tc>
+        <w:tc>
+          <w:tcPr>
+            <w:tcW w:type="dxa" w:w="2016"/>
+          </w:tcPr>
+          <w:p>
+            <w:r/>
+            <w:r>
+              <w:rPr>
+                <w:sz w:val="18"/>
+              </w:rPr>
+              <w:t>Conference Chair · Head of Department</w:t>
+            </w:r>
+          </w:p>
+        </w:tc>
+        <w:tc>
+          <w:tcPr>
+            <w:tcW w:type="dxa" w:w="4752"/>
+          </w:tcPr>
+          <w:p>
+            <w:r/>
+            <w:r>
+              <w:rPr>
+                <w:sz w:val="18"/>
+              </w:rPr>
               <w:t>Department of Computer Science and Engineering, SSCSE, Sharda University, Greater Noida, India</w:t>
+            </w:r>
+          </w:p>
+        </w:tc>
+      </w:tr>
+      <w:tr>
+        <w:tc>
+          <w:tcPr>
+            <w:tcW w:type="dxa" w:w="2736"/>
+          </w:tcPr>
+          <w:p>
+            <w:r/>
+            <w:r>
+              <w:rPr>
+                <w:sz w:val="18"/>
+              </w:rPr>
+              <w:t>Dr. Rajneesh Kumar Singh</w:t>
+            </w:r>
+          </w:p>
+        </w:tc>
+        <w:tc>
+          <w:tcPr>
+            <w:tcW w:type="dxa" w:w="2016"/>
+          </w:tcPr>
+          <w:p>
+            <w:r/>
+            <w:r>
+              <w:rPr>
+                <w:sz w:val="18"/>
+              </w:rPr>
+              <w:t>Conference Chair · Head of Department</w:t>
+            </w:r>
+          </w:p>
+        </w:tc>
+        <w:tc>
+          <w:tcPr>
+            <w:tcW w:type="dxa" w:w="4752"/>
+          </w:tcPr>
+          <w:p>
+            <w:r/>
+            <w:r>
+              <w:rPr>
+                <w:sz w:val="18"/>
+              </w:rPr>
+              <w:t>Department of Computer Science and Applications, SSCSE, Sharda University, Greater Noida, India</w:t>
             </w:r>
           </w:p>
         </w:tc>
@@ -8165,7 +8165,7 @@
           <w:color w:val="0A0A0A"/>
           <w:sz w:val="22"/>
         </w:rPr>
-        <w:t>International Advisory Committee</w:t>
+        <w:t>Convener</w:t>
       </w:r>
     </w:p>
     <w:tbl>
@@ -8210,7 +8210,7 @@
                 <w:color w:val="FFFFFF"/>
                 <w:sz w:val="18"/>
               </w:rPr>
-              <w:t>Country</w:t>
+              <w:t>Role</w:t>
             </w:r>
           </w:p>
         </w:tc>
@@ -8243,7 +8243,7 @@
               <w:rPr>
                 <w:sz w:val="18"/>
               </w:rPr>
-              <w:t>Gautam Srivastava</w:t>
+              <w:t>Dr. Bharat Bhushan</w:t>
             </w:r>
           </w:p>
         </w:tc>
@@ -8257,7 +8257,7 @@
               <w:rPr>
                 <w:sz w:val="18"/>
               </w:rPr>
-              <w:t>Canada</w:t>
+              <w:t>Convener · Associate Professor</w:t>
             </w:r>
           </w:p>
         </w:tc>
@@ -8271,799 +8271,7 @@
               <w:rPr>
                 <w:sz w:val="18"/>
               </w:rPr>
-              <w:t>Brandon University</w:t>
-            </w:r>
-          </w:p>
-        </w:tc>
-      </w:tr>
-      <w:tr>
-        <w:tc>
-          <w:tcPr>
-            <w:tcW w:type="dxa" w:w="2736"/>
-          </w:tcPr>
-          <w:p>
-            <w:r/>
-            <w:r>
-              <w:rPr>
-                <w:sz w:val="18"/>
-              </w:rPr>
-              <w:t>Muhannmad Ajmal Azad</w:t>
-            </w:r>
-          </w:p>
-        </w:tc>
-        <w:tc>
-          <w:tcPr>
-            <w:tcW w:type="dxa" w:w="2016"/>
-          </w:tcPr>
-          <w:p>
-            <w:r/>
-            <w:r>
-              <w:rPr>
-                <w:sz w:val="18"/>
-              </w:rPr>
-              <w:t>United Kingdom</w:t>
-            </w:r>
-          </w:p>
-        </w:tc>
-        <w:tc>
-          <w:tcPr>
-            <w:tcW w:type="dxa" w:w="4752"/>
-          </w:tcPr>
-          <w:p>
-            <w:r/>
-            <w:r>
-              <w:rPr>
-                <w:sz w:val="18"/>
-              </w:rPr>
-              <w:t>Birmingham City University</w:t>
-            </w:r>
-          </w:p>
-        </w:tc>
-      </w:tr>
-      <w:tr>
-        <w:tc>
-          <w:tcPr>
-            <w:tcW w:type="dxa" w:w="2736"/>
-          </w:tcPr>
-          <w:p>
-            <w:r/>
-            <w:r>
-              <w:rPr>
-                <w:sz w:val="18"/>
-              </w:rPr>
-              <w:t>Rolando Herrero</w:t>
-            </w:r>
-          </w:p>
-        </w:tc>
-        <w:tc>
-          <w:tcPr>
-            <w:tcW w:type="dxa" w:w="2016"/>
-          </w:tcPr>
-          <w:p>
-            <w:r/>
-            <w:r>
-              <w:rPr>
-                <w:sz w:val="18"/>
-              </w:rPr>
-              <w:t>USA</w:t>
-            </w:r>
-          </w:p>
-        </w:tc>
-        <w:tc>
-          <w:tcPr>
-            <w:tcW w:type="dxa" w:w="4752"/>
-          </w:tcPr>
-          <w:p>
-            <w:r/>
-            <w:r>
-              <w:rPr>
-                <w:sz w:val="18"/>
-              </w:rPr>
-              <w:t>Northeastern University, University of Massachusetts Lowell</w:t>
-            </w:r>
-          </w:p>
-        </w:tc>
-      </w:tr>
-      <w:tr>
-        <w:tc>
-          <w:tcPr>
-            <w:tcW w:type="dxa" w:w="2736"/>
-          </w:tcPr>
-          <w:p>
-            <w:r/>
-            <w:r>
-              <w:rPr>
-                <w:sz w:val="18"/>
-              </w:rPr>
-              <w:t>Sérgio Duarte Correia</w:t>
-            </w:r>
-          </w:p>
-        </w:tc>
-        <w:tc>
-          <w:tcPr>
-            <w:tcW w:type="dxa" w:w="2016"/>
-          </w:tcPr>
-          <w:p>
-            <w:r/>
-            <w:r>
-              <w:rPr>
-                <w:sz w:val="18"/>
-              </w:rPr>
-              <w:t>Portugal</w:t>
-            </w:r>
-          </w:p>
-        </w:tc>
-        <w:tc>
-          <w:tcPr>
-            <w:tcW w:type="dxa" w:w="4752"/>
-          </w:tcPr>
-          <w:p>
-            <w:r/>
-            <w:r>
-              <w:rPr>
-                <w:sz w:val="18"/>
-              </w:rPr>
-              <w:t>Portalegre Polytechnic University</w:t>
-            </w:r>
-          </w:p>
-        </w:tc>
-      </w:tr>
-      <w:tr>
-        <w:tc>
-          <w:tcPr>
-            <w:tcW w:type="dxa" w:w="2736"/>
-          </w:tcPr>
-          <w:p>
-            <w:r/>
-            <w:r>
-              <w:rPr>
-                <w:sz w:val="18"/>
-              </w:rPr>
-              <w:t>Vinícius Lima</w:t>
-            </w:r>
-          </w:p>
-        </w:tc>
-        <w:tc>
-          <w:tcPr>
-            <w:tcW w:type="dxa" w:w="2016"/>
-          </w:tcPr>
-          <w:p>
-            <w:r/>
-            <w:r>
-              <w:rPr>
-                <w:sz w:val="18"/>
-              </w:rPr>
-              <w:t>Portugal</w:t>
-            </w:r>
-          </w:p>
-        </w:tc>
-        <w:tc>
-          <w:tcPr>
-            <w:tcW w:type="dxa" w:w="4752"/>
-          </w:tcPr>
-          <w:p>
-            <w:r/>
-            <w:r>
-              <w:rPr>
-                <w:sz w:val="18"/>
-              </w:rPr>
-              <w:t>Faculty of Medicine, University of Porto</w:t>
-            </w:r>
-          </w:p>
-        </w:tc>
-      </w:tr>
-      <w:tr>
-        <w:tc>
-          <w:tcPr>
-            <w:tcW w:type="dxa" w:w="2736"/>
-          </w:tcPr>
-          <w:p>
-            <w:r/>
-            <w:r>
-              <w:rPr>
-                <w:sz w:val="18"/>
-              </w:rPr>
-              <w:t>Dr. Rania Lampou</w:t>
-            </w:r>
-          </w:p>
-        </w:tc>
-        <w:tc>
-          <w:tcPr>
-            <w:tcW w:type="dxa" w:w="2016"/>
-          </w:tcPr>
-          <w:p>
-            <w:r/>
-            <w:r>
-              <w:rPr>
-                <w:sz w:val="18"/>
-              </w:rPr>
-              <w:t>Greece</w:t>
-            </w:r>
-          </w:p>
-        </w:tc>
-        <w:tc>
-          <w:tcPr>
-            <w:tcW w:type="dxa" w:w="4752"/>
-          </w:tcPr>
-          <w:p>
-            <w:r/>
-            <w:r>
-              <w:rPr>
-                <w:sz w:val="18"/>
-              </w:rPr>
-              <w:t>Ministry of Education, Religious Affairs and Sports, Greece</w:t>
-            </w:r>
-          </w:p>
-        </w:tc>
-      </w:tr>
-      <w:tr>
-        <w:tc>
-          <w:tcPr>
-            <w:tcW w:type="dxa" w:w="2736"/>
-          </w:tcPr>
-          <w:p>
-            <w:r/>
-            <w:r>
-              <w:rPr>
-                <w:sz w:val="18"/>
-              </w:rPr>
-              <w:t>Fernando Ortiz-Rodríguez</w:t>
-            </w:r>
-          </w:p>
-        </w:tc>
-        <w:tc>
-          <w:tcPr>
-            <w:tcW w:type="dxa" w:w="2016"/>
-          </w:tcPr>
-          <w:p>
-            <w:r/>
-            <w:r>
-              <w:rPr>
-                <w:sz w:val="18"/>
-              </w:rPr>
-              <w:t>Mexico</w:t>
-            </w:r>
-          </w:p>
-        </w:tc>
-        <w:tc>
-          <w:tcPr>
-            <w:tcW w:type="dxa" w:w="4752"/>
-          </w:tcPr>
-          <w:p>
-            <w:r/>
-            <w:r>
-              <w:rPr>
-                <w:sz w:val="18"/>
-              </w:rPr>
-              <w:t>Universidad Autónoma de Tamaulipas</w:t>
-            </w:r>
-          </w:p>
-        </w:tc>
-      </w:tr>
-      <w:tr>
-        <w:tc>
-          <w:tcPr>
-            <w:tcW w:type="dxa" w:w="2736"/>
-          </w:tcPr>
-          <w:p>
-            <w:r/>
-            <w:r>
-              <w:rPr>
-                <w:sz w:val="18"/>
-              </w:rPr>
-              <w:t>Faisal Nabi</w:t>
-            </w:r>
-          </w:p>
-        </w:tc>
-        <w:tc>
-          <w:tcPr>
-            <w:tcW w:type="dxa" w:w="2016"/>
-          </w:tcPr>
-          <w:p>
-            <w:r/>
-            <w:r>
-              <w:rPr>
-                <w:sz w:val="18"/>
-              </w:rPr>
-              <w:t>Australia</w:t>
-            </w:r>
-          </w:p>
-        </w:tc>
-        <w:tc>
-          <w:tcPr>
-            <w:tcW w:type="dxa" w:w="4752"/>
-          </w:tcPr>
-          <w:p>
-            <w:r/>
-            <w:r>
-              <w:rPr>
-                <w:sz w:val="18"/>
-              </w:rPr>
-              <w:t>University of Southern Queensland (USQ)</w:t>
-            </w:r>
-          </w:p>
-        </w:tc>
-      </w:tr>
-      <w:tr>
-        <w:tc>
-          <w:tcPr>
-            <w:tcW w:type="dxa" w:w="2736"/>
-          </w:tcPr>
-          <w:p>
-            <w:r/>
-            <w:r>
-              <w:rPr>
-                <w:sz w:val="18"/>
-              </w:rPr>
-              <w:t>Ivanna Dronyuk</w:t>
-            </w:r>
-          </w:p>
-        </w:tc>
-        <w:tc>
-          <w:tcPr>
-            <w:tcW w:type="dxa" w:w="2016"/>
-          </w:tcPr>
-          <w:p>
-            <w:r/>
-            <w:r>
-              <w:rPr>
-                <w:sz w:val="18"/>
-              </w:rPr>
-              <w:t>Poland</w:t>
-            </w:r>
-          </w:p>
-        </w:tc>
-        <w:tc>
-          <w:tcPr>
-            <w:tcW w:type="dxa" w:w="4752"/>
-          </w:tcPr>
-          <w:p>
-            <w:r/>
-            <w:r>
-              <w:rPr>
-                <w:sz w:val="18"/>
-              </w:rPr>
-              <w:t>Jan Dlugosz University in Czestochowa</w:t>
-            </w:r>
-          </w:p>
-        </w:tc>
-      </w:tr>
-      <w:tr>
-        <w:tc>
-          <w:tcPr>
-            <w:tcW w:type="dxa" w:w="2736"/>
-          </w:tcPr>
-          <w:p>
-            <w:r/>
-            <w:r>
-              <w:rPr>
-                <w:sz w:val="18"/>
-              </w:rPr>
-              <w:t>Muhamad Fazil Ahmad</w:t>
-            </w:r>
-          </w:p>
-        </w:tc>
-        <w:tc>
-          <w:tcPr>
-            <w:tcW w:type="dxa" w:w="2016"/>
-          </w:tcPr>
-          <w:p>
-            <w:r/>
-            <w:r>
-              <w:rPr>
-                <w:sz w:val="18"/>
-              </w:rPr>
-              <w:t>Malaysia</w:t>
-            </w:r>
-          </w:p>
-        </w:tc>
-        <w:tc>
-          <w:tcPr>
-            <w:tcW w:type="dxa" w:w="4752"/>
-          </w:tcPr>
-          <w:p>
-            <w:r/>
-            <w:r>
-              <w:rPr>
-                <w:sz w:val="18"/>
-              </w:rPr>
-              <w:t>Universiti Sultan Zainal Abidin</w:t>
-            </w:r>
-          </w:p>
-        </w:tc>
-      </w:tr>
-      <w:tr>
-        <w:tc>
-          <w:tcPr>
-            <w:tcW w:type="dxa" w:w="2736"/>
-          </w:tcPr>
-          <w:p>
-            <w:r/>
-            <w:r>
-              <w:rPr>
-                <w:sz w:val="18"/>
-              </w:rPr>
-              <w:t>Noor Zaman Jhanjhi</w:t>
-            </w:r>
-          </w:p>
-        </w:tc>
-        <w:tc>
-          <w:tcPr>
-            <w:tcW w:type="dxa" w:w="2016"/>
-          </w:tcPr>
-          <w:p>
-            <w:r/>
-            <w:r>
-              <w:rPr>
-                <w:sz w:val="18"/>
-              </w:rPr>
-              <w:t>Malaysia</w:t>
-            </w:r>
-          </w:p>
-        </w:tc>
-        <w:tc>
-          <w:tcPr>
-            <w:tcW w:type="dxa" w:w="4752"/>
-          </w:tcPr>
-          <w:p>
-            <w:r/>
-            <w:r>
-              <w:rPr>
-                <w:sz w:val="18"/>
-              </w:rPr>
-              <w:t>Sunway University</w:t>
-            </w:r>
-          </w:p>
-        </w:tc>
-      </w:tr>
-      <w:tr>
-        <w:tc>
-          <w:tcPr>
-            <w:tcW w:type="dxa" w:w="2736"/>
-          </w:tcPr>
-          <w:p>
-            <w:r/>
-            <w:r>
-              <w:rPr>
-                <w:sz w:val="18"/>
-              </w:rPr>
-              <w:t>Pinar Demircioglu</w:t>
-            </w:r>
-          </w:p>
-        </w:tc>
-        <w:tc>
-          <w:tcPr>
-            <w:tcW w:type="dxa" w:w="2016"/>
-          </w:tcPr>
-          <w:p>
-            <w:r/>
-            <w:r>
-              <w:rPr>
-                <w:sz w:val="18"/>
-              </w:rPr>
-              <w:t>Turkiye</w:t>
-            </w:r>
-          </w:p>
-        </w:tc>
-        <w:tc>
-          <w:tcPr>
-            <w:tcW w:type="dxa" w:w="4752"/>
-          </w:tcPr>
-          <w:p>
-            <w:r/>
-            <w:r>
-              <w:rPr>
-                <w:sz w:val="18"/>
-              </w:rPr>
-              <w:t>Aydin Adnan Menderes University</w:t>
-            </w:r>
-          </w:p>
-        </w:tc>
-      </w:tr>
-      <w:tr>
-        <w:tc>
-          <w:tcPr>
-            <w:tcW w:type="dxa" w:w="2736"/>
-          </w:tcPr>
-          <w:p>
-            <w:r/>
-            <w:r>
-              <w:rPr>
-                <w:sz w:val="18"/>
-              </w:rPr>
-              <w:t>Inam Ullah</w:t>
-            </w:r>
-          </w:p>
-        </w:tc>
-        <w:tc>
-          <w:tcPr>
-            <w:tcW w:type="dxa" w:w="2016"/>
-          </w:tcPr>
-          <w:p>
-            <w:r/>
-            <w:r>
-              <w:rPr>
-                <w:sz w:val="18"/>
-              </w:rPr>
-              <w:t>South Korea</w:t>
-            </w:r>
-          </w:p>
-        </w:tc>
-        <w:tc>
-          <w:tcPr>
-            <w:tcW w:type="dxa" w:w="4752"/>
-          </w:tcPr>
-          <w:p>
-            <w:r/>
-            <w:r>
-              <w:rPr>
-                <w:sz w:val="18"/>
-              </w:rPr>
-              <w:t>Department of Computer Engineering, Gachon University, Seongnam</w:t>
-            </w:r>
-          </w:p>
-        </w:tc>
-      </w:tr>
-      <w:tr>
-        <w:tc>
-          <w:tcPr>
-            <w:tcW w:type="dxa" w:w="2736"/>
-          </w:tcPr>
-          <w:p>
-            <w:r/>
-            <w:r>
-              <w:rPr>
-                <w:sz w:val="18"/>
-              </w:rPr>
-              <w:t>Mohammed Edan AlKhazraje</w:t>
-            </w:r>
-          </w:p>
-        </w:tc>
-        <w:tc>
-          <w:tcPr>
-            <w:tcW w:type="dxa" w:w="2016"/>
-          </w:tcPr>
-          <w:p>
-            <w:r/>
-            <w:r>
-              <w:rPr>
-                <w:sz w:val="18"/>
-              </w:rPr>
-              <w:t>Iraq</w:t>
-            </w:r>
-          </w:p>
-        </w:tc>
-        <w:tc>
-          <w:tcPr>
-            <w:tcW w:type="dxa" w:w="4752"/>
-          </w:tcPr>
-          <w:p>
-            <w:r/>
-            <w:r>
-              <w:rPr>
-                <w:sz w:val="18"/>
-              </w:rPr>
-              <w:t>Middle Technical University / Institute of Administration, Rusafa</w:t>
-            </w:r>
-          </w:p>
-        </w:tc>
-      </w:tr>
-      <w:tr>
-        <w:tc>
-          <w:tcPr>
-            <w:tcW w:type="dxa" w:w="2736"/>
-          </w:tcPr>
-          <w:p>
-            <w:r/>
-            <w:r>
-              <w:rPr>
-                <w:sz w:val="18"/>
-              </w:rPr>
-              <w:t>Oloruntoyin Sefiu Taiwo</w:t>
-            </w:r>
-          </w:p>
-        </w:tc>
-        <w:tc>
-          <w:tcPr>
-            <w:tcW w:type="dxa" w:w="2016"/>
-          </w:tcPr>
-          <w:p>
-            <w:r/>
-            <w:r>
-              <w:rPr>
-                <w:sz w:val="18"/>
-              </w:rPr>
-              <w:t>Nigeria</w:t>
-            </w:r>
-          </w:p>
-        </w:tc>
-        <w:tc>
-          <w:tcPr>
-            <w:tcW w:type="dxa" w:w="4752"/>
-          </w:tcPr>
-          <w:p>
-            <w:r/>
-            <w:r>
-              <w:rPr>
-                <w:sz w:val="18"/>
-              </w:rPr>
-              <w:t>Federal Polytechnic Ayede</w:t>
-            </w:r>
-          </w:p>
-        </w:tc>
-      </w:tr>
-      <w:tr>
-        <w:tc>
-          <w:tcPr>
-            <w:tcW w:type="dxa" w:w="2736"/>
-          </w:tcPr>
-          <w:p>
-            <w:r/>
-            <w:r>
-              <w:rPr>
-                <w:sz w:val="18"/>
-              </w:rPr>
-              <w:t>Dr. Ismail Adaramola Abdul Azeez</w:t>
-            </w:r>
-          </w:p>
-        </w:tc>
-        <w:tc>
-          <w:tcPr>
-            <w:tcW w:type="dxa" w:w="2016"/>
-          </w:tcPr>
-          <w:p>
-            <w:r/>
-            <w:r>
-              <w:rPr>
-                <w:sz w:val="18"/>
-              </w:rPr>
-              <w:t>USA</w:t>
-            </w:r>
-          </w:p>
-        </w:tc>
-        <w:tc>
-          <w:tcPr>
-            <w:tcW w:type="dxa" w:w="4752"/>
-          </w:tcPr>
-          <w:p>
-            <w:r/>
-            <w:r>
-              <w:rPr>
-                <w:sz w:val="18"/>
-              </w:rPr>
-              <w:t>Passion International University, Colorado</w:t>
-            </w:r>
-          </w:p>
-        </w:tc>
-      </w:tr>
-      <w:tr>
-        <w:tc>
-          <w:tcPr>
-            <w:tcW w:type="dxa" w:w="2736"/>
-          </w:tcPr>
-          <w:p>
-            <w:r/>
-            <w:r>
-              <w:rPr>
-                <w:sz w:val="18"/>
-              </w:rPr>
-              <w:t>Muhammad Bilal</w:t>
-            </w:r>
-          </w:p>
-        </w:tc>
-        <w:tc>
-          <w:tcPr>
-            <w:tcW w:type="dxa" w:w="2016"/>
-          </w:tcPr>
-          <w:p>
-            <w:r/>
-            <w:r>
-              <w:rPr>
-                <w:sz w:val="18"/>
-              </w:rPr>
-              <w:t>Pakistan</w:t>
-            </w:r>
-          </w:p>
-        </w:tc>
-        <w:tc>
-          <w:tcPr>
-            <w:tcW w:type="dxa" w:w="4752"/>
-          </w:tcPr>
-          <w:p>
-            <w:r/>
-            <w:r>
-              <w:rPr>
-                <w:sz w:val="18"/>
-              </w:rPr>
-              <w:t>National University of Computer and Emerging Sciences</w:t>
-            </w:r>
-          </w:p>
-        </w:tc>
-      </w:tr>
-      <w:tr>
-        <w:tc>
-          <w:tcPr>
-            <w:tcW w:type="dxa" w:w="2736"/>
-          </w:tcPr>
-          <w:p>
-            <w:r/>
-            <w:r>
-              <w:rPr>
-                <w:sz w:val="18"/>
-              </w:rPr>
-              <w:t>Cun Ji</w:t>
-            </w:r>
-          </w:p>
-        </w:tc>
-        <w:tc>
-          <w:tcPr>
-            <w:tcW w:type="dxa" w:w="2016"/>
-          </w:tcPr>
-          <w:p>
-            <w:r/>
-            <w:r>
-              <w:rPr>
-                <w:sz w:val="18"/>
-              </w:rPr>
-              <w:t>China</w:t>
-            </w:r>
-          </w:p>
-        </w:tc>
-        <w:tc>
-          <w:tcPr>
-            <w:tcW w:type="dxa" w:w="4752"/>
-          </w:tcPr>
-          <w:p>
-            <w:r/>
-            <w:r>
-              <w:rPr>
-                <w:sz w:val="18"/>
-              </w:rPr>
-              <w:t>Shandong Normal University</w:t>
-            </w:r>
-          </w:p>
-        </w:tc>
-      </w:tr>
-      <w:tr>
-        <w:tc>
-          <w:tcPr>
-            <w:tcW w:type="dxa" w:w="2736"/>
-          </w:tcPr>
-          <w:p>
-            <w:r/>
-            <w:r>
-              <w:rPr>
-                <w:sz w:val="18"/>
-              </w:rPr>
-              <w:t>Alaa Abdulhady Jaber</w:t>
-            </w:r>
-          </w:p>
-        </w:tc>
-        <w:tc>
-          <w:tcPr>
-            <w:tcW w:type="dxa" w:w="2016"/>
-          </w:tcPr>
-          <w:p>
-            <w:r/>
-            <w:r>
-              <w:rPr>
-                <w:sz w:val="18"/>
-              </w:rPr>
-              <w:t>Iraq</w:t>
-            </w:r>
-          </w:p>
-        </w:tc>
-        <w:tc>
-          <w:tcPr>
-            <w:tcW w:type="dxa" w:w="4752"/>
-          </w:tcPr>
-          <w:p>
-            <w:r/>
-            <w:r>
-              <w:rPr>
-                <w:sz w:val="18"/>
-              </w:rPr>
-              <w:t>Mechanical Engineering College, University of Technology-Iraq</w:t>
+              <w:t>Department of Computer Science and Engineering, SSCSE, Sharda University, Greater Noida, India</w:t>
             </w:r>
           </w:p>
         </w:tc>
@@ -9085,7 +8293,7 @@
           <w:color w:val="0A0A0A"/>
           <w:sz w:val="22"/>
         </w:rPr>
-        <w:t>National Advisory Committee</w:t>
+        <w:t>International Advisory Committee</w:t>
       </w:r>
     </w:p>
     <w:tbl>
@@ -9163,7 +8371,7 @@
               <w:rPr>
                 <w:sz w:val="18"/>
               </w:rPr>
-              <w:t>To be announced</w:t>
+              <w:t>Gautam Srivastava</w:t>
             </w:r>
           </w:p>
         </w:tc>
@@ -9177,7 +8385,7 @@
               <w:rPr>
                 <w:sz w:val="18"/>
               </w:rPr>
-              <w:t>National advisor</w:t>
+              <w:t>Canada</w:t>
             </w:r>
           </w:p>
         </w:tc>
@@ -9191,7 +8399,7 @@
               <w:rPr>
                 <w:sz w:val="18"/>
               </w:rPr>
-              <w:t>To be confirmed</w:t>
+              <w:t>Brandon University</w:t>
             </w:r>
           </w:p>
         </w:tc>
@@ -9207,7 +8415,7 @@
               <w:rPr>
                 <w:sz w:val="18"/>
               </w:rPr>
-              <w:t>To be announced</w:t>
+              <w:t>Muhannmad Ajmal Azad</w:t>
             </w:r>
           </w:p>
         </w:tc>
@@ -9221,7 +8429,7 @@
               <w:rPr>
                 <w:sz w:val="18"/>
               </w:rPr>
-              <w:t>National advisor</w:t>
+              <w:t>United Kingdom</w:t>
             </w:r>
           </w:p>
         </w:tc>
@@ -9235,7 +8443,7 @@
               <w:rPr>
                 <w:sz w:val="18"/>
               </w:rPr>
-              <w:t>To be confirmed</w:t>
+              <w:t>Birmingham City University</w:t>
             </w:r>
           </w:p>
         </w:tc>
@@ -9251,7 +8459,7 @@
               <w:rPr>
                 <w:sz w:val="18"/>
               </w:rPr>
-              <w:t>To be announced</w:t>
+              <w:t>Rolando Herrero</w:t>
             </w:r>
           </w:p>
         </w:tc>
@@ -9265,7 +8473,7 @@
               <w:rPr>
                 <w:sz w:val="18"/>
               </w:rPr>
-              <w:t>National advisor</w:t>
+              <w:t>USA</w:t>
             </w:r>
           </w:p>
         </w:tc>
@@ -9279,7 +8487,7 @@
               <w:rPr>
                 <w:sz w:val="18"/>
               </w:rPr>
-              <w:t>To be confirmed</w:t>
+              <w:t>Northeastern University, University of Massachusetts Lowell</w:t>
             </w:r>
           </w:p>
         </w:tc>
@@ -9295,7 +8503,7 @@
               <w:rPr>
                 <w:sz w:val="18"/>
               </w:rPr>
-              <w:t>To be announced</w:t>
+              <w:t>Sérgio Duarte Correia</w:t>
             </w:r>
           </w:p>
         </w:tc>
@@ -9309,7 +8517,7 @@
               <w:rPr>
                 <w:sz w:val="18"/>
               </w:rPr>
-              <w:t>National advisor</w:t>
+              <w:t>Portugal</w:t>
             </w:r>
           </w:p>
         </w:tc>
@@ -9323,7 +8531,7 @@
               <w:rPr>
                 <w:sz w:val="18"/>
               </w:rPr>
-              <w:t>To be confirmed</w:t>
+              <w:t>Portalegre Polytechnic University</w:t>
             </w:r>
           </w:p>
         </w:tc>
@@ -9339,7 +8547,7 @@
               <w:rPr>
                 <w:sz w:val="18"/>
               </w:rPr>
-              <w:t>To be announced</w:t>
+              <w:t>Vinícius Lima</w:t>
             </w:r>
           </w:p>
         </w:tc>
@@ -9353,7 +8561,7 @@
               <w:rPr>
                 <w:sz w:val="18"/>
               </w:rPr>
-              <w:t>National advisor</w:t>
+              <w:t>Portugal</w:t>
             </w:r>
           </w:p>
         </w:tc>
@@ -9367,7 +8575,7 @@
               <w:rPr>
                 <w:sz w:val="18"/>
               </w:rPr>
-              <w:t>To be confirmed</w:t>
+              <w:t>Faculty of Medicine, University of Porto</w:t>
             </w:r>
           </w:p>
         </w:tc>
@@ -9383,7 +8591,7 @@
               <w:rPr>
                 <w:sz w:val="18"/>
               </w:rPr>
-              <w:t>To be announced</w:t>
+              <w:t>Dr. Rania Lampou</w:t>
             </w:r>
           </w:p>
         </w:tc>
@@ -9397,7 +8605,7 @@
               <w:rPr>
                 <w:sz w:val="18"/>
               </w:rPr>
-              <w:t>National advisor</w:t>
+              <w:t>Greece</w:t>
             </w:r>
           </w:p>
         </w:tc>
@@ -9411,7 +8619,7 @@
               <w:rPr>
                 <w:sz w:val="18"/>
               </w:rPr>
-              <w:t>To be confirmed</w:t>
+              <w:t>Ministry of Education, Religious Affairs and Sports, Greece</w:t>
             </w:r>
           </w:p>
         </w:tc>
@@ -9427,7 +8635,7 @@
               <w:rPr>
                 <w:sz w:val="18"/>
               </w:rPr>
-              <w:t>To be announced</w:t>
+              <w:t>Fernando Ortiz-Rodríguez</w:t>
             </w:r>
           </w:p>
         </w:tc>
@@ -9441,7 +8649,7 @@
               <w:rPr>
                 <w:sz w:val="18"/>
               </w:rPr>
-              <w:t>National advisor</w:t>
+              <w:t>Mexico</w:t>
             </w:r>
           </w:p>
         </w:tc>
@@ -9455,7 +8663,535 @@
               <w:rPr>
                 <w:sz w:val="18"/>
               </w:rPr>
-              <w:t>To be confirmed</w:t>
+              <w:t>Universidad Autónoma de Tamaulipas</w:t>
+            </w:r>
+          </w:p>
+        </w:tc>
+      </w:tr>
+      <w:tr>
+        <w:tc>
+          <w:tcPr>
+            <w:tcW w:type="dxa" w:w="2736"/>
+          </w:tcPr>
+          <w:p>
+            <w:r/>
+            <w:r>
+              <w:rPr>
+                <w:sz w:val="18"/>
+              </w:rPr>
+              <w:t>Faisal Nabi</w:t>
+            </w:r>
+          </w:p>
+        </w:tc>
+        <w:tc>
+          <w:tcPr>
+            <w:tcW w:type="dxa" w:w="2016"/>
+          </w:tcPr>
+          <w:p>
+            <w:r/>
+            <w:r>
+              <w:rPr>
+                <w:sz w:val="18"/>
+              </w:rPr>
+              <w:t>Australia</w:t>
+            </w:r>
+          </w:p>
+        </w:tc>
+        <w:tc>
+          <w:tcPr>
+            <w:tcW w:type="dxa" w:w="4752"/>
+          </w:tcPr>
+          <w:p>
+            <w:r/>
+            <w:r>
+              <w:rPr>
+                <w:sz w:val="18"/>
+              </w:rPr>
+              <w:t>University of Southern Queensland (USQ)</w:t>
+            </w:r>
+          </w:p>
+        </w:tc>
+      </w:tr>
+      <w:tr>
+        <w:tc>
+          <w:tcPr>
+            <w:tcW w:type="dxa" w:w="2736"/>
+          </w:tcPr>
+          <w:p>
+            <w:r/>
+            <w:r>
+              <w:rPr>
+                <w:sz w:val="18"/>
+              </w:rPr>
+              <w:t>Ivanna Dronyuk</w:t>
+            </w:r>
+          </w:p>
+        </w:tc>
+        <w:tc>
+          <w:tcPr>
+            <w:tcW w:type="dxa" w:w="2016"/>
+          </w:tcPr>
+          <w:p>
+            <w:r/>
+            <w:r>
+              <w:rPr>
+                <w:sz w:val="18"/>
+              </w:rPr>
+              <w:t>Poland</w:t>
+            </w:r>
+          </w:p>
+        </w:tc>
+        <w:tc>
+          <w:tcPr>
+            <w:tcW w:type="dxa" w:w="4752"/>
+          </w:tcPr>
+          <w:p>
+            <w:r/>
+            <w:r>
+              <w:rPr>
+                <w:sz w:val="18"/>
+              </w:rPr>
+              <w:t>Jan Dlugosz University in Czestochowa</w:t>
+            </w:r>
+          </w:p>
+        </w:tc>
+      </w:tr>
+      <w:tr>
+        <w:tc>
+          <w:tcPr>
+            <w:tcW w:type="dxa" w:w="2736"/>
+          </w:tcPr>
+          <w:p>
+            <w:r/>
+            <w:r>
+              <w:rPr>
+                <w:sz w:val="18"/>
+              </w:rPr>
+              <w:t>Muhamad Fazil Ahmad</w:t>
+            </w:r>
+          </w:p>
+        </w:tc>
+        <w:tc>
+          <w:tcPr>
+            <w:tcW w:type="dxa" w:w="2016"/>
+          </w:tcPr>
+          <w:p>
+            <w:r/>
+            <w:r>
+              <w:rPr>
+                <w:sz w:val="18"/>
+              </w:rPr>
+              <w:t>Malaysia</w:t>
+            </w:r>
+          </w:p>
+        </w:tc>
+        <w:tc>
+          <w:tcPr>
+            <w:tcW w:type="dxa" w:w="4752"/>
+          </w:tcPr>
+          <w:p>
+            <w:r/>
+            <w:r>
+              <w:rPr>
+                <w:sz w:val="18"/>
+              </w:rPr>
+              <w:t>Universiti Sultan Zainal Abidin</w:t>
+            </w:r>
+          </w:p>
+        </w:tc>
+      </w:tr>
+      <w:tr>
+        <w:tc>
+          <w:tcPr>
+            <w:tcW w:type="dxa" w:w="2736"/>
+          </w:tcPr>
+          <w:p>
+            <w:r/>
+            <w:r>
+              <w:rPr>
+                <w:sz w:val="18"/>
+              </w:rPr>
+              <w:t>Noor Zaman Jhanjhi</w:t>
+            </w:r>
+          </w:p>
+        </w:tc>
+        <w:tc>
+          <w:tcPr>
+            <w:tcW w:type="dxa" w:w="2016"/>
+          </w:tcPr>
+          <w:p>
+            <w:r/>
+            <w:r>
+              <w:rPr>
+                <w:sz w:val="18"/>
+              </w:rPr>
+              <w:t>Malaysia</w:t>
+            </w:r>
+          </w:p>
+        </w:tc>
+        <w:tc>
+          <w:tcPr>
+            <w:tcW w:type="dxa" w:w="4752"/>
+          </w:tcPr>
+          <w:p>
+            <w:r/>
+            <w:r>
+              <w:rPr>
+                <w:sz w:val="18"/>
+              </w:rPr>
+              <w:t>Sunway University</w:t>
+            </w:r>
+          </w:p>
+        </w:tc>
+      </w:tr>
+      <w:tr>
+        <w:tc>
+          <w:tcPr>
+            <w:tcW w:type="dxa" w:w="2736"/>
+          </w:tcPr>
+          <w:p>
+            <w:r/>
+            <w:r>
+              <w:rPr>
+                <w:sz w:val="18"/>
+              </w:rPr>
+              <w:t>Pinar Demircioglu</w:t>
+            </w:r>
+          </w:p>
+        </w:tc>
+        <w:tc>
+          <w:tcPr>
+            <w:tcW w:type="dxa" w:w="2016"/>
+          </w:tcPr>
+          <w:p>
+            <w:r/>
+            <w:r>
+              <w:rPr>
+                <w:sz w:val="18"/>
+              </w:rPr>
+              <w:t>Turkiye</w:t>
+            </w:r>
+          </w:p>
+        </w:tc>
+        <w:tc>
+          <w:tcPr>
+            <w:tcW w:type="dxa" w:w="4752"/>
+          </w:tcPr>
+          <w:p>
+            <w:r/>
+            <w:r>
+              <w:rPr>
+                <w:sz w:val="18"/>
+              </w:rPr>
+              <w:t>Aydin Adnan Menderes University</w:t>
+            </w:r>
+          </w:p>
+        </w:tc>
+      </w:tr>
+      <w:tr>
+        <w:tc>
+          <w:tcPr>
+            <w:tcW w:type="dxa" w:w="2736"/>
+          </w:tcPr>
+          <w:p>
+            <w:r/>
+            <w:r>
+              <w:rPr>
+                <w:sz w:val="18"/>
+              </w:rPr>
+              <w:t>Inam Ullah</w:t>
+            </w:r>
+          </w:p>
+        </w:tc>
+        <w:tc>
+          <w:tcPr>
+            <w:tcW w:type="dxa" w:w="2016"/>
+          </w:tcPr>
+          <w:p>
+            <w:r/>
+            <w:r>
+              <w:rPr>
+                <w:sz w:val="18"/>
+              </w:rPr>
+              <w:t>South Korea</w:t>
+            </w:r>
+          </w:p>
+        </w:tc>
+        <w:tc>
+          <w:tcPr>
+            <w:tcW w:type="dxa" w:w="4752"/>
+          </w:tcPr>
+          <w:p>
+            <w:r/>
+            <w:r>
+              <w:rPr>
+                <w:sz w:val="18"/>
+              </w:rPr>
+              <w:t>Department of Computer Engineering, Gachon University, Seongnam</w:t>
+            </w:r>
+          </w:p>
+        </w:tc>
+      </w:tr>
+      <w:tr>
+        <w:tc>
+          <w:tcPr>
+            <w:tcW w:type="dxa" w:w="2736"/>
+          </w:tcPr>
+          <w:p>
+            <w:r/>
+            <w:r>
+              <w:rPr>
+                <w:sz w:val="18"/>
+              </w:rPr>
+              <w:t>Mohammed Edan AlKhazraje</w:t>
+            </w:r>
+          </w:p>
+        </w:tc>
+        <w:tc>
+          <w:tcPr>
+            <w:tcW w:type="dxa" w:w="2016"/>
+          </w:tcPr>
+          <w:p>
+            <w:r/>
+            <w:r>
+              <w:rPr>
+                <w:sz w:val="18"/>
+              </w:rPr>
+              <w:t>Iraq</w:t>
+            </w:r>
+          </w:p>
+        </w:tc>
+        <w:tc>
+          <w:tcPr>
+            <w:tcW w:type="dxa" w:w="4752"/>
+          </w:tcPr>
+          <w:p>
+            <w:r/>
+            <w:r>
+              <w:rPr>
+                <w:sz w:val="18"/>
+              </w:rPr>
+              <w:t>Middle Technical University / Institute of Administration, Rusafa</w:t>
+            </w:r>
+          </w:p>
+        </w:tc>
+      </w:tr>
+      <w:tr>
+        <w:tc>
+          <w:tcPr>
+            <w:tcW w:type="dxa" w:w="2736"/>
+          </w:tcPr>
+          <w:p>
+            <w:r/>
+            <w:r>
+              <w:rPr>
+                <w:sz w:val="18"/>
+              </w:rPr>
+              <w:t>Oloruntoyin Sefiu Taiwo</w:t>
+            </w:r>
+          </w:p>
+        </w:tc>
+        <w:tc>
+          <w:tcPr>
+            <w:tcW w:type="dxa" w:w="2016"/>
+          </w:tcPr>
+          <w:p>
+            <w:r/>
+            <w:r>
+              <w:rPr>
+                <w:sz w:val="18"/>
+              </w:rPr>
+              <w:t>Nigeria</w:t>
+            </w:r>
+          </w:p>
+        </w:tc>
+        <w:tc>
+          <w:tcPr>
+            <w:tcW w:type="dxa" w:w="4752"/>
+          </w:tcPr>
+          <w:p>
+            <w:r/>
+            <w:r>
+              <w:rPr>
+                <w:sz w:val="18"/>
+              </w:rPr>
+              <w:t>Federal Polytechnic Ayede</w:t>
+            </w:r>
+          </w:p>
+        </w:tc>
+      </w:tr>
+      <w:tr>
+        <w:tc>
+          <w:tcPr>
+            <w:tcW w:type="dxa" w:w="2736"/>
+          </w:tcPr>
+          <w:p>
+            <w:r/>
+            <w:r>
+              <w:rPr>
+                <w:sz w:val="18"/>
+              </w:rPr>
+              <w:t>Dr. Ismail Adaramola Abdul Azeez</w:t>
+            </w:r>
+          </w:p>
+        </w:tc>
+        <w:tc>
+          <w:tcPr>
+            <w:tcW w:type="dxa" w:w="2016"/>
+          </w:tcPr>
+          <w:p>
+            <w:r/>
+            <w:r>
+              <w:rPr>
+                <w:sz w:val="18"/>
+              </w:rPr>
+              <w:t>USA</w:t>
+            </w:r>
+          </w:p>
+        </w:tc>
+        <w:tc>
+          <w:tcPr>
+            <w:tcW w:type="dxa" w:w="4752"/>
+          </w:tcPr>
+          <w:p>
+            <w:r/>
+            <w:r>
+              <w:rPr>
+                <w:sz w:val="18"/>
+              </w:rPr>
+              <w:t>Passion International University, Colorado</w:t>
+            </w:r>
+          </w:p>
+        </w:tc>
+      </w:tr>
+      <w:tr>
+        <w:tc>
+          <w:tcPr>
+            <w:tcW w:type="dxa" w:w="2736"/>
+          </w:tcPr>
+          <w:p>
+            <w:r/>
+            <w:r>
+              <w:rPr>
+                <w:sz w:val="18"/>
+              </w:rPr>
+              <w:t>Muhammad Bilal</w:t>
+            </w:r>
+          </w:p>
+        </w:tc>
+        <w:tc>
+          <w:tcPr>
+            <w:tcW w:type="dxa" w:w="2016"/>
+          </w:tcPr>
+          <w:p>
+            <w:r/>
+            <w:r>
+              <w:rPr>
+                <w:sz w:val="18"/>
+              </w:rPr>
+              <w:t>Pakistan</w:t>
+            </w:r>
+          </w:p>
+        </w:tc>
+        <w:tc>
+          <w:tcPr>
+            <w:tcW w:type="dxa" w:w="4752"/>
+          </w:tcPr>
+          <w:p>
+            <w:r/>
+            <w:r>
+              <w:rPr>
+                <w:sz w:val="18"/>
+              </w:rPr>
+              <w:t>National University of Computer and Emerging Sciences</w:t>
+            </w:r>
+          </w:p>
+        </w:tc>
+      </w:tr>
+      <w:tr>
+        <w:tc>
+          <w:tcPr>
+            <w:tcW w:type="dxa" w:w="2736"/>
+          </w:tcPr>
+          <w:p>
+            <w:r/>
+            <w:r>
+              <w:rPr>
+                <w:sz w:val="18"/>
+              </w:rPr>
+              <w:t>Cun Ji</w:t>
+            </w:r>
+          </w:p>
+        </w:tc>
+        <w:tc>
+          <w:tcPr>
+            <w:tcW w:type="dxa" w:w="2016"/>
+          </w:tcPr>
+          <w:p>
+            <w:r/>
+            <w:r>
+              <w:rPr>
+                <w:sz w:val="18"/>
+              </w:rPr>
+              <w:t>China</w:t>
+            </w:r>
+          </w:p>
+        </w:tc>
+        <w:tc>
+          <w:tcPr>
+            <w:tcW w:type="dxa" w:w="4752"/>
+          </w:tcPr>
+          <w:p>
+            <w:r/>
+            <w:r>
+              <w:rPr>
+                <w:sz w:val="18"/>
+              </w:rPr>
+              <w:t>Shandong Normal University</w:t>
+            </w:r>
+          </w:p>
+        </w:tc>
+      </w:tr>
+      <w:tr>
+        <w:tc>
+          <w:tcPr>
+            <w:tcW w:type="dxa" w:w="2736"/>
+          </w:tcPr>
+          <w:p>
+            <w:r/>
+            <w:r>
+              <w:rPr>
+                <w:sz w:val="18"/>
+              </w:rPr>
+              <w:t>Alaa Abdulhady Jaber</w:t>
+            </w:r>
+          </w:p>
+        </w:tc>
+        <w:tc>
+          <w:tcPr>
+            <w:tcW w:type="dxa" w:w="2016"/>
+          </w:tcPr>
+          <w:p>
+            <w:r/>
+            <w:r>
+              <w:rPr>
+                <w:sz w:val="18"/>
+              </w:rPr>
+              <w:t>Iraq</w:t>
+            </w:r>
+          </w:p>
+        </w:tc>
+        <w:tc>
+          <w:tcPr>
+            <w:tcW w:type="dxa" w:w="4752"/>
+          </w:tcPr>
+          <w:p>
+            <w:r/>
+            <w:r>
+              <w:rPr>
+                <w:sz w:val="18"/>
+              </w:rPr>
+              <w:t>Mechanical Engineering College, University of Technology-Iraq</w:t>
             </w:r>
           </w:p>
         </w:tc>
@@ -9465,20 +9201,6 @@
       <w:pPr>
         <w:spacing w:after="80"/>
       </w:pPr>
-    </w:p>
-    <w:p>
-      <w:pPr>
-        <w:spacing w:before="280" w:after="100"/>
-      </w:pPr>
-      <w:r>
-        <w:rPr>
-          <w:b/>
-          <w:i w:val="0"/>
-          <w:color w:val="0A0A0A"/>
-          <w:sz w:val="27"/>
-        </w:rPr>
-        <w:t>Technical Program Committee</w:t>
-      </w:r>
     </w:p>
     <w:p>
       <w:pPr>
@@ -9491,7 +9213,7 @@
           <w:color w:val="0A0A0A"/>
           <w:sz w:val="22"/>
         </w:rPr>
-        <w:t>Track chairs</w:t>
+        <w:t>National Advisory Committee</w:t>
       </w:r>
     </w:p>
     <w:tbl>
@@ -9536,7 +9258,7 @@
                 <w:color w:val="FFFFFF"/>
                 <w:sz w:val="18"/>
               </w:rPr>
-              <w:t>Role</w:t>
+              <w:t>Country</w:t>
             </w:r>
           </w:p>
         </w:tc>
@@ -9569,7 +9291,7 @@
               <w:rPr>
                 <w:sz w:val="18"/>
               </w:rPr>
-              <w:t>Dr. Ali Imam Abidi</w:t>
+              <w:t>To be announced</w:t>
             </w:r>
           </w:p>
         </w:tc>
@@ -9583,7 +9305,7 @@
               <w:rPr>
                 <w:sz w:val="18"/>
               </w:rPr>
-              <w:t>Track 1 chair</w:t>
+              <w:t>National advisor</w:t>
             </w:r>
           </w:p>
         </w:tc>
@@ -9597,7 +9319,7 @@
               <w:rPr>
                 <w:sz w:val="18"/>
               </w:rPr>
-              <w:t>Artificial Intelligence and Intelligent Systems</w:t>
+              <w:t>To be confirmed</w:t>
             </w:r>
           </w:p>
         </w:tc>
@@ -9613,7 +9335,7 @@
               <w:rPr>
                 <w:sz w:val="18"/>
               </w:rPr>
-              <w:t>Dr. Sudeep Varshney</w:t>
+              <w:t>To be announced</w:t>
             </w:r>
           </w:p>
         </w:tc>
@@ -9627,7 +9349,7 @@
               <w:rPr>
                 <w:sz w:val="18"/>
               </w:rPr>
-              <w:t>Track 2 chair</w:t>
+              <w:t>National advisor</w:t>
             </w:r>
           </w:p>
         </w:tc>
@@ -9641,7 +9363,7 @@
               <w:rPr>
                 <w:sz w:val="18"/>
               </w:rPr>
-              <w:t>Data Science, Analytics and Intelligent Computing</w:t>
+              <w:t>To be confirmed</w:t>
             </w:r>
           </w:p>
         </w:tc>
@@ -9657,7 +9379,7 @@
               <w:rPr>
                 <w:sz w:val="18"/>
               </w:rPr>
-              <w:t>Dr. Shajee Mohan</w:t>
+              <w:t>To be announced</w:t>
             </w:r>
           </w:p>
         </w:tc>
@@ -9671,7 +9393,7 @@
               <w:rPr>
                 <w:sz w:val="18"/>
               </w:rPr>
-              <w:t>Track 3 chair</w:t>
+              <w:t>National advisor</w:t>
             </w:r>
           </w:p>
         </w:tc>
@@ -9685,7 +9407,7 @@
               <w:rPr>
                 <w:sz w:val="18"/>
               </w:rPr>
-              <w:t>Cybersecurity, Privacy and Blockchain Technologies</w:t>
+              <w:t>To be confirmed</w:t>
             </w:r>
           </w:p>
         </w:tc>
@@ -9701,7 +9423,7 @@
               <w:rPr>
                 <w:sz w:val="18"/>
               </w:rPr>
-              <w:t>Dr. Bharat Bhushan</w:t>
+              <w:t>To be announced</w:t>
             </w:r>
           </w:p>
         </w:tc>
@@ -9715,7 +9437,7 @@
               <w:rPr>
                 <w:sz w:val="18"/>
               </w:rPr>
-              <w:t>Track 4 chair</w:t>
+              <w:t>National advisor</w:t>
             </w:r>
           </w:p>
         </w:tc>
@@ -9729,7 +9451,7 @@
               <w:rPr>
                 <w:sz w:val="18"/>
               </w:rPr>
-              <w:t>Computer Networks and Next-Generation Communication Systems</w:t>
+              <w:t>To be confirmed</w:t>
             </w:r>
           </w:p>
         </w:tc>
@@ -9745,7 +9467,7 @@
               <w:rPr>
                 <w:sz w:val="18"/>
               </w:rPr>
-              <w:t>Dr. Avinash Kumar</w:t>
+              <w:t>To be announced</w:t>
             </w:r>
           </w:p>
         </w:tc>
@@ -9759,7 +9481,7 @@
               <w:rPr>
                 <w:sz w:val="18"/>
               </w:rPr>
-              <w:t>Track 5 chair</w:t>
+              <w:t>National advisor</w:t>
             </w:r>
           </w:p>
         </w:tc>
@@ -9773,7 +9495,7 @@
               <w:rPr>
                 <w:sz w:val="18"/>
               </w:rPr>
-              <w:t>Internet of Things, Robotics and Intelligent Automation</w:t>
+              <w:t>To be confirmed</w:t>
             </w:r>
           </w:p>
         </w:tc>
@@ -9789,7 +9511,7 @@
               <w:rPr>
                 <w:sz w:val="18"/>
               </w:rPr>
-              <w:t>Dr. Nidhi Gupta</w:t>
+              <w:t>To be announced</w:t>
             </w:r>
           </w:p>
         </w:tc>
@@ -9803,7 +9525,7 @@
               <w:rPr>
                 <w:sz w:val="18"/>
               </w:rPr>
-              <w:t>Track 6 chair</w:t>
+              <w:t>National advisor</w:t>
             </w:r>
           </w:p>
         </w:tc>
@@ -9817,7 +9539,51 @@
               <w:rPr>
                 <w:sz w:val="18"/>
               </w:rPr>
-              <w:t>Interdisciplinary Computing and Future Technologies</w:t>
+              <w:t>To be confirmed</w:t>
+            </w:r>
+          </w:p>
+        </w:tc>
+      </w:tr>
+      <w:tr>
+        <w:tc>
+          <w:tcPr>
+            <w:tcW w:type="dxa" w:w="2736"/>
+          </w:tcPr>
+          <w:p>
+            <w:r/>
+            <w:r>
+              <w:rPr>
+                <w:sz w:val="18"/>
+              </w:rPr>
+              <w:t>To be announced</w:t>
+            </w:r>
+          </w:p>
+        </w:tc>
+        <w:tc>
+          <w:tcPr>
+            <w:tcW w:type="dxa" w:w="2016"/>
+          </w:tcPr>
+          <w:p>
+            <w:r/>
+            <w:r>
+              <w:rPr>
+                <w:sz w:val="18"/>
+              </w:rPr>
+              <w:t>National advisor</w:t>
+            </w:r>
+          </w:p>
+        </w:tc>
+        <w:tc>
+          <w:tcPr>
+            <w:tcW w:type="dxa" w:w="4752"/>
+          </w:tcPr>
+          <w:p>
+            <w:r/>
+            <w:r>
+              <w:rPr>
+                <w:sz w:val="18"/>
+              </w:rPr>
+              <w:t>To be confirmed</w:t>
             </w:r>
           </w:p>
         </w:tc>
@@ -9827,6 +9593,20 @@
       <w:pPr>
         <w:spacing w:after="80"/>
       </w:pPr>
+    </w:p>
+    <w:p>
+      <w:pPr>
+        <w:spacing w:before="280" w:after="100"/>
+      </w:pPr>
+      <w:r>
+        <w:rPr>
+          <w:b/>
+          <w:i w:val="0"/>
+          <w:color w:val="0A0A0A"/>
+          <w:sz w:val="27"/>
+        </w:rPr>
+        <w:t>Technical Program Committee</w:t>
+      </w:r>
     </w:p>
     <w:p>
       <w:pPr>
@@ -9839,7 +9619,7 @@
           <w:color w:val="0A0A0A"/>
           <w:sz w:val="22"/>
         </w:rPr>
-        <w:t>Publication Chair</w:t>
+        <w:t>Track chairs</w:t>
       </w:r>
     </w:p>
     <w:tbl>
@@ -9917,7 +9697,7 @@
               <w:rPr>
                 <w:sz w:val="18"/>
               </w:rPr>
-              <w:t>Dr. Nikhil Sharma</w:t>
+              <w:t>Dr. Ali Imam Abidi</w:t>
             </w:r>
           </w:p>
         </w:tc>
@@ -9931,7 +9711,7 @@
               <w:rPr>
                 <w:sz w:val="18"/>
               </w:rPr>
-              <w:t>Publication Chair</w:t>
+              <w:t>Track 1 chair</w:t>
             </w:r>
           </w:p>
         </w:tc>
@@ -9945,7 +9725,227 @@
               <w:rPr>
                 <w:sz w:val="18"/>
               </w:rPr>
-              <w:t>Department of Computer Science and Engineering, SSCSE, Sharda University, Greater Noida, India</w:t>
+              <w:t>Artificial Intelligence and Intelligent Systems</w:t>
+            </w:r>
+          </w:p>
+        </w:tc>
+      </w:tr>
+      <w:tr>
+        <w:tc>
+          <w:tcPr>
+            <w:tcW w:type="dxa" w:w="2736"/>
+          </w:tcPr>
+          <w:p>
+            <w:r/>
+            <w:r>
+              <w:rPr>
+                <w:sz w:val="18"/>
+              </w:rPr>
+              <w:t>Dr. Sudeep Varshney</w:t>
+            </w:r>
+          </w:p>
+        </w:tc>
+        <w:tc>
+          <w:tcPr>
+            <w:tcW w:type="dxa" w:w="2016"/>
+          </w:tcPr>
+          <w:p>
+            <w:r/>
+            <w:r>
+              <w:rPr>
+                <w:sz w:val="18"/>
+              </w:rPr>
+              <w:t>Track 2 chair</w:t>
+            </w:r>
+          </w:p>
+        </w:tc>
+        <w:tc>
+          <w:tcPr>
+            <w:tcW w:type="dxa" w:w="4752"/>
+          </w:tcPr>
+          <w:p>
+            <w:r/>
+            <w:r>
+              <w:rPr>
+                <w:sz w:val="18"/>
+              </w:rPr>
+              <w:t>Data Science, Analytics and Intelligent Computing</w:t>
+            </w:r>
+          </w:p>
+        </w:tc>
+      </w:tr>
+      <w:tr>
+        <w:tc>
+          <w:tcPr>
+            <w:tcW w:type="dxa" w:w="2736"/>
+          </w:tcPr>
+          <w:p>
+            <w:r/>
+            <w:r>
+              <w:rPr>
+                <w:sz w:val="18"/>
+              </w:rPr>
+              <w:t>Dr. Shajee Mohan</w:t>
+            </w:r>
+          </w:p>
+        </w:tc>
+        <w:tc>
+          <w:tcPr>
+            <w:tcW w:type="dxa" w:w="2016"/>
+          </w:tcPr>
+          <w:p>
+            <w:r/>
+            <w:r>
+              <w:rPr>
+                <w:sz w:val="18"/>
+              </w:rPr>
+              <w:t>Track 3 chair</w:t>
+            </w:r>
+          </w:p>
+        </w:tc>
+        <w:tc>
+          <w:tcPr>
+            <w:tcW w:type="dxa" w:w="4752"/>
+          </w:tcPr>
+          <w:p>
+            <w:r/>
+            <w:r>
+              <w:rPr>
+                <w:sz w:val="18"/>
+              </w:rPr>
+              <w:t>Cybersecurity, Privacy and Blockchain Technologies</w:t>
+            </w:r>
+          </w:p>
+        </w:tc>
+      </w:tr>
+      <w:tr>
+        <w:tc>
+          <w:tcPr>
+            <w:tcW w:type="dxa" w:w="2736"/>
+          </w:tcPr>
+          <w:p>
+            <w:r/>
+            <w:r>
+              <w:rPr>
+                <w:sz w:val="18"/>
+              </w:rPr>
+              <w:t>Dr. Bharat Bhushan</w:t>
+            </w:r>
+          </w:p>
+        </w:tc>
+        <w:tc>
+          <w:tcPr>
+            <w:tcW w:type="dxa" w:w="2016"/>
+          </w:tcPr>
+          <w:p>
+            <w:r/>
+            <w:r>
+              <w:rPr>
+                <w:sz w:val="18"/>
+              </w:rPr>
+              <w:t>Track 4 chair</w:t>
+            </w:r>
+          </w:p>
+        </w:tc>
+        <w:tc>
+          <w:tcPr>
+            <w:tcW w:type="dxa" w:w="4752"/>
+          </w:tcPr>
+          <w:p>
+            <w:r/>
+            <w:r>
+              <w:rPr>
+                <w:sz w:val="18"/>
+              </w:rPr>
+              <w:t>Computer Networks and Next-Generation Communication Systems</w:t>
+            </w:r>
+          </w:p>
+        </w:tc>
+      </w:tr>
+      <w:tr>
+        <w:tc>
+          <w:tcPr>
+            <w:tcW w:type="dxa" w:w="2736"/>
+          </w:tcPr>
+          <w:p>
+            <w:r/>
+            <w:r>
+              <w:rPr>
+                <w:sz w:val="18"/>
+              </w:rPr>
+              <w:t>Dr. Avinash Kumar</w:t>
+            </w:r>
+          </w:p>
+        </w:tc>
+        <w:tc>
+          <w:tcPr>
+            <w:tcW w:type="dxa" w:w="2016"/>
+          </w:tcPr>
+          <w:p>
+            <w:r/>
+            <w:r>
+              <w:rPr>
+                <w:sz w:val="18"/>
+              </w:rPr>
+              <w:t>Track 5 chair</w:t>
+            </w:r>
+          </w:p>
+        </w:tc>
+        <w:tc>
+          <w:tcPr>
+            <w:tcW w:type="dxa" w:w="4752"/>
+          </w:tcPr>
+          <w:p>
+            <w:r/>
+            <w:r>
+              <w:rPr>
+                <w:sz w:val="18"/>
+              </w:rPr>
+              <w:t>Internet of Things, Robotics and Intelligent Automation</w:t>
+            </w:r>
+          </w:p>
+        </w:tc>
+      </w:tr>
+      <w:tr>
+        <w:tc>
+          <w:tcPr>
+            <w:tcW w:type="dxa" w:w="2736"/>
+          </w:tcPr>
+          <w:p>
+            <w:r/>
+            <w:r>
+              <w:rPr>
+                <w:sz w:val="18"/>
+              </w:rPr>
+              <w:t>Dr. Nidhi Gupta</w:t>
+            </w:r>
+          </w:p>
+        </w:tc>
+        <w:tc>
+          <w:tcPr>
+            <w:tcW w:type="dxa" w:w="2016"/>
+          </w:tcPr>
+          <w:p>
+            <w:r/>
+            <w:r>
+              <w:rPr>
+                <w:sz w:val="18"/>
+              </w:rPr>
+              <w:t>Track 6 chair</w:t>
+            </w:r>
+          </w:p>
+        </w:tc>
+        <w:tc>
+          <w:tcPr>
+            <w:tcW w:type="dxa" w:w="4752"/>
+          </w:tcPr>
+          <w:p>
+            <w:r/>
+            <w:r>
+              <w:rPr>
+                <w:sz w:val="18"/>
+              </w:rPr>
+              <w:t>Interdisciplinary Computing and Future Technologies</w:t>
             </w:r>
           </w:p>
         </w:tc>
@@ -9967,7 +9967,7 @@
           <w:color w:val="0A0A0A"/>
           <w:sz w:val="22"/>
         </w:rPr>
-        <w:t>Technical Program Chairs</w:t>
+        <w:t>Publication Chair</w:t>
       </w:r>
     </w:p>
     <w:tbl>
@@ -10045,7 +10045,7 @@
               <w:rPr>
                 <w:sz w:val="18"/>
               </w:rPr>
-              <w:t>Kamiya Khatter</w:t>
+              <w:t>Dr. Nikhil Sharma</w:t>
             </w:r>
           </w:p>
         </w:tc>
@@ -10059,315 +10059,7 @@
               <w:rPr>
                 <w:sz w:val="18"/>
               </w:rPr>
-              <w:t>Technical Program Chair</w:t>
-            </w:r>
-          </w:p>
-        </w:tc>
-        <w:tc>
-          <w:tcPr>
-            <w:tcW w:type="dxa" w:w="4752"/>
-          </w:tcPr>
-          <w:p>
-            <w:r/>
-            <w:r>
-              <w:rPr>
-                <w:sz w:val="18"/>
-              </w:rPr>
-              <w:t>Springer</w:t>
-            </w:r>
-          </w:p>
-        </w:tc>
-      </w:tr>
-      <w:tr>
-        <w:tc>
-          <w:tcPr>
-            <w:tcW w:type="dxa" w:w="2736"/>
-          </w:tcPr>
-          <w:p>
-            <w:r/>
-            <w:r>
-              <w:rPr>
-                <w:sz w:val="18"/>
-              </w:rPr>
-              <w:t>To be announced</w:t>
-            </w:r>
-          </w:p>
-        </w:tc>
-        <w:tc>
-          <w:tcPr>
-            <w:tcW w:type="dxa" w:w="2016"/>
-          </w:tcPr>
-          <w:p>
-            <w:r/>
-            <w:r>
-              <w:rPr>
-                <w:sz w:val="18"/>
-              </w:rPr>
-              <w:t>International Technical Program Chair</w:t>
-            </w:r>
-          </w:p>
-        </w:tc>
-        <w:tc>
-          <w:tcPr>
-            <w:tcW w:type="dxa" w:w="4752"/>
-          </w:tcPr>
-          <w:p>
-            <w:r/>
-            <w:r>
-              <w:rPr>
-                <w:sz w:val="18"/>
-              </w:rPr>
-              <w:t>To be confirmed</w:t>
-            </w:r>
-          </w:p>
-        </w:tc>
-      </w:tr>
-      <w:tr>
-        <w:tc>
-          <w:tcPr>
-            <w:tcW w:type="dxa" w:w="2736"/>
-          </w:tcPr>
-          <w:p>
-            <w:r/>
-            <w:r>
-              <w:rPr>
-                <w:sz w:val="18"/>
-              </w:rPr>
-              <w:t>To be announced</w:t>
-            </w:r>
-          </w:p>
-        </w:tc>
-        <w:tc>
-          <w:tcPr>
-            <w:tcW w:type="dxa" w:w="2016"/>
-          </w:tcPr>
-          <w:p>
-            <w:r/>
-            <w:r>
-              <w:rPr>
-                <w:sz w:val="18"/>
-              </w:rPr>
-              <w:t>International Technical Program Chair</w:t>
-            </w:r>
-          </w:p>
-        </w:tc>
-        <w:tc>
-          <w:tcPr>
-            <w:tcW w:type="dxa" w:w="4752"/>
-          </w:tcPr>
-          <w:p>
-            <w:r/>
-            <w:r>
-              <w:rPr>
-                <w:sz w:val="18"/>
-              </w:rPr>
-              <w:t>To be confirmed</w:t>
-            </w:r>
-          </w:p>
-        </w:tc>
-      </w:tr>
-      <w:tr>
-        <w:tc>
-          <w:tcPr>
-            <w:tcW w:type="dxa" w:w="2736"/>
-          </w:tcPr>
-          <w:p>
-            <w:r/>
-            <w:r>
-              <w:rPr>
-                <w:sz w:val="18"/>
-              </w:rPr>
-              <w:t>To be announced</w:t>
-            </w:r>
-          </w:p>
-        </w:tc>
-        <w:tc>
-          <w:tcPr>
-            <w:tcW w:type="dxa" w:w="2016"/>
-          </w:tcPr>
-          <w:p>
-            <w:r/>
-            <w:r>
-              <w:rPr>
-                <w:sz w:val="18"/>
-              </w:rPr>
-              <w:t>International Technical Program Chair</w:t>
-            </w:r>
-          </w:p>
-        </w:tc>
-        <w:tc>
-          <w:tcPr>
-            <w:tcW w:type="dxa" w:w="4752"/>
-          </w:tcPr>
-          <w:p>
-            <w:r/>
-            <w:r>
-              <w:rPr>
-                <w:sz w:val="18"/>
-              </w:rPr>
-              <w:t>To be confirmed</w:t>
-            </w:r>
-          </w:p>
-        </w:tc>
-      </w:tr>
-      <w:tr>
-        <w:tc>
-          <w:tcPr>
-            <w:tcW w:type="dxa" w:w="2736"/>
-          </w:tcPr>
-          <w:p>
-            <w:r/>
-            <w:r>
-              <w:rPr>
-                <w:sz w:val="18"/>
-              </w:rPr>
-              <w:t>To be announced</w:t>
-            </w:r>
-          </w:p>
-        </w:tc>
-        <w:tc>
-          <w:tcPr>
-            <w:tcW w:type="dxa" w:w="2016"/>
-          </w:tcPr>
-          <w:p>
-            <w:r/>
-            <w:r>
-              <w:rPr>
-                <w:sz w:val="18"/>
-              </w:rPr>
-              <w:t>International Technical Program Chair</w:t>
-            </w:r>
-          </w:p>
-        </w:tc>
-        <w:tc>
-          <w:tcPr>
-            <w:tcW w:type="dxa" w:w="4752"/>
-          </w:tcPr>
-          <w:p>
-            <w:r/>
-            <w:r>
-              <w:rPr>
-                <w:sz w:val="18"/>
-              </w:rPr>
-              <w:t>To be confirmed</w:t>
-            </w:r>
-          </w:p>
-        </w:tc>
-      </w:tr>
-      <w:tr>
-        <w:tc>
-          <w:tcPr>
-            <w:tcW w:type="dxa" w:w="2736"/>
-          </w:tcPr>
-          <w:p>
-            <w:r/>
-            <w:r>
-              <w:rPr>
-                <w:sz w:val="18"/>
-              </w:rPr>
-              <w:t>Dr. Keshav Kaushik</w:t>
-            </w:r>
-          </w:p>
-        </w:tc>
-        <w:tc>
-          <w:tcPr>
-            <w:tcW w:type="dxa" w:w="2016"/>
-          </w:tcPr>
-          <w:p>
-            <w:r/>
-            <w:r>
-              <w:rPr>
-                <w:sz w:val="18"/>
-              </w:rPr>
-              <w:t>Technical Program Chair · Associate Professor</w:t>
-            </w:r>
-          </w:p>
-        </w:tc>
-        <w:tc>
-          <w:tcPr>
-            <w:tcW w:type="dxa" w:w="4752"/>
-          </w:tcPr>
-          <w:p>
-            <w:r/>
-            <w:r>
-              <w:rPr>
-                <w:sz w:val="18"/>
-              </w:rPr>
-              <w:t>Department of Computer Science and Engineering, SSCSE, Sharda University, Greater Noida, India</w:t>
-            </w:r>
-          </w:p>
-        </w:tc>
-      </w:tr>
-      <w:tr>
-        <w:tc>
-          <w:tcPr>
-            <w:tcW w:type="dxa" w:w="2736"/>
-          </w:tcPr>
-          <w:p>
-            <w:r/>
-            <w:r>
-              <w:rPr>
-                <w:sz w:val="18"/>
-              </w:rPr>
-              <w:t>Dr. K. Meena</w:t>
-            </w:r>
-          </w:p>
-        </w:tc>
-        <w:tc>
-          <w:tcPr>
-            <w:tcW w:type="dxa" w:w="2016"/>
-          </w:tcPr>
-          <w:p>
-            <w:r/>
-            <w:r>
-              <w:rPr>
-                <w:sz w:val="18"/>
-              </w:rPr>
-              <w:t>Technical Program Chair · Professor</w:t>
-            </w:r>
-          </w:p>
-        </w:tc>
-        <w:tc>
-          <w:tcPr>
-            <w:tcW w:type="dxa" w:w="4752"/>
-          </w:tcPr>
-          <w:p>
-            <w:r/>
-            <w:r>
-              <w:rPr>
-                <w:sz w:val="18"/>
-              </w:rPr>
-              <w:t>Department of Computer Science and Engineering, SSCSE, Sharda University, Greater Noida, India</w:t>
-            </w:r>
-          </w:p>
-        </w:tc>
-      </w:tr>
-      <w:tr>
-        <w:tc>
-          <w:tcPr>
-            <w:tcW w:type="dxa" w:w="2736"/>
-          </w:tcPr>
-          <w:p>
-            <w:r/>
-            <w:r>
-              <w:rPr>
-                <w:sz w:val="18"/>
-              </w:rPr>
-              <w:t>Dr. Amrit Agarwal</w:t>
-            </w:r>
-          </w:p>
-        </w:tc>
-        <w:tc>
-          <w:tcPr>
-            <w:tcW w:type="dxa" w:w="2016"/>
-          </w:tcPr>
-          <w:p>
-            <w:r/>
-            <w:r>
-              <w:rPr>
-                <w:sz w:val="18"/>
-              </w:rPr>
-              <w:t>Technical Program Chair · Associate Professor</w:t>
+              <w:t>Publication Chair</w:t>
             </w:r>
           </w:p>
         </w:tc>
@@ -10403,7 +10095,7 @@
           <w:color w:val="0A0A0A"/>
           <w:sz w:val="22"/>
         </w:rPr>
-        <w:t>Technical Program Committee members</w:t>
+        <w:t>Technical Program Chairs</w:t>
       </w:r>
     </w:p>
     <w:tbl>
@@ -10448,7 +10140,7 @@
                 <w:color w:val="FFFFFF"/>
                 <w:sz w:val="18"/>
               </w:rPr>
-              <w:t>Country</w:t>
+              <w:t>Role</w:t>
             </w:r>
           </w:p>
         </w:tc>
@@ -10481,7 +10173,7 @@
               <w:rPr>
                 <w:sz w:val="18"/>
               </w:rPr>
-              <w:t>Ekta Maini</w:t>
+              <w:t>Kamiya Khatter</w:t>
             </w:r>
           </w:p>
         </w:tc>
@@ -10495,7 +10187,7 @@
               <w:rPr>
                 <w:sz w:val="18"/>
               </w:rPr>
-              <w:t>India</w:t>
+              <w:t>Technical Program Chair</w:t>
             </w:r>
           </w:p>
         </w:tc>
@@ -10509,7 +10201,7 @@
               <w:rPr>
                 <w:sz w:val="18"/>
               </w:rPr>
-              <w:t>Amity University Hyderabad</w:t>
+              <w:t>Springer</w:t>
             </w:r>
           </w:p>
         </w:tc>
@@ -10525,7 +10217,7 @@
               <w:rPr>
                 <w:sz w:val="18"/>
               </w:rPr>
-              <w:t>Prof. Anuja Arora</w:t>
+              <w:t>To be announced</w:t>
             </w:r>
           </w:p>
         </w:tc>
@@ -10539,7 +10231,7 @@
               <w:rPr>
                 <w:sz w:val="18"/>
               </w:rPr>
-              <w:t>India</w:t>
+              <w:t>International Technical Program Chair</w:t>
             </w:r>
           </w:p>
         </w:tc>
@@ -10553,7 +10245,7 @@
               <w:rPr>
                 <w:sz w:val="18"/>
               </w:rPr>
-              <w:t>Jaypee Institute of Information Technology</w:t>
+              <w:t>To be confirmed</w:t>
             </w:r>
           </w:p>
         </w:tc>
@@ -10569,7 +10261,7 @@
               <w:rPr>
                 <w:sz w:val="18"/>
               </w:rPr>
-              <w:t>Sannasi Chakravarthy S R</w:t>
+              <w:t>To be announced</w:t>
             </w:r>
           </w:p>
         </w:tc>
@@ -10583,7 +10275,7 @@
               <w:rPr>
                 <w:sz w:val="18"/>
               </w:rPr>
-              <w:t>India</w:t>
+              <w:t>International Technical Program Chair</w:t>
             </w:r>
           </w:p>
         </w:tc>
@@ -10597,7 +10289,7 @@
               <w:rPr>
                 <w:sz w:val="18"/>
               </w:rPr>
-              <w:t>Bannari Amman Institute of Technology</w:t>
+              <w:t>To be confirmed</w:t>
             </w:r>
           </w:p>
         </w:tc>
@@ -10613,7 +10305,7 @@
               <w:rPr>
                 <w:sz w:val="18"/>
               </w:rPr>
-              <w:t>Dr. R. Manikandan</w:t>
+              <w:t>To be announced</w:t>
             </w:r>
           </w:p>
         </w:tc>
@@ -10627,7 +10319,7 @@
               <w:rPr>
                 <w:sz w:val="18"/>
               </w:rPr>
-              <w:t>India</w:t>
+              <w:t>International Technical Program Chair</w:t>
             </w:r>
           </w:p>
         </w:tc>
@@ -10641,7 +10333,7 @@
               <w:rPr>
                 <w:sz w:val="18"/>
               </w:rPr>
-              <w:t>School of Computing, SASTRA Deemed University</w:t>
+              <w:t>To be confirmed</w:t>
             </w:r>
           </w:p>
         </w:tc>
@@ -10657,7 +10349,7 @@
               <w:rPr>
                 <w:sz w:val="18"/>
               </w:rPr>
-              <w:t>Dr. Avijit Kumar Chaudhuri</w:t>
+              <w:t>To be announced</w:t>
             </w:r>
           </w:p>
         </w:tc>
@@ -10671,7 +10363,7 @@
               <w:rPr>
                 <w:sz w:val="18"/>
               </w:rPr>
-              <w:t>India</w:t>
+              <w:t>International Technical Program Chair</w:t>
             </w:r>
           </w:p>
         </w:tc>
@@ -10685,7 +10377,7 @@
               <w:rPr>
                 <w:sz w:val="18"/>
               </w:rPr>
-              <w:t>Brainware University</w:t>
+              <w:t>To be confirmed</w:t>
             </w:r>
           </w:p>
         </w:tc>
@@ -10701,7 +10393,7 @@
               <w:rPr>
                 <w:sz w:val="18"/>
               </w:rPr>
-              <w:t>Dr. Nishant Doshi</w:t>
+              <w:t>Dr. Keshav Kaushik</w:t>
             </w:r>
           </w:p>
         </w:tc>
@@ -10715,7 +10407,7 @@
               <w:rPr>
                 <w:sz w:val="18"/>
               </w:rPr>
-              <w:t>India</w:t>
+              <w:t>Technical Program Chair · Associate Professor</w:t>
             </w:r>
           </w:p>
         </w:tc>
@@ -10729,7 +10421,7 @@
               <w:rPr>
                 <w:sz w:val="18"/>
               </w:rPr>
-              <w:t>Pandit Deendayal Energy University (PDEU), Gandhinagar</w:t>
+              <w:t>Department of Computer Science and Engineering, SSCSE, Sharda University, Greater Noida, India</w:t>
             </w:r>
           </w:p>
         </w:tc>
@@ -10745,7 +10437,7 @@
               <w:rPr>
                 <w:sz w:val="18"/>
               </w:rPr>
-              <w:t>Janmenjoy Nayak</w:t>
+              <w:t>Dr. K. Meena</w:t>
             </w:r>
           </w:p>
         </w:tc>
@@ -10759,7 +10451,7 @@
               <w:rPr>
                 <w:sz w:val="18"/>
               </w:rPr>
-              <w:t>India</w:t>
+              <w:t>Technical Program Chair · Professor</w:t>
             </w:r>
           </w:p>
         </w:tc>
@@ -10773,7 +10465,7 @@
               <w:rPr>
                 <w:sz w:val="18"/>
               </w:rPr>
-              <w:t>MSCB University, Odisha</w:t>
+              <w:t>Department of Computer Science and Engineering, SSCSE, Sharda University, Greater Noida, India</w:t>
             </w:r>
           </w:p>
         </w:tc>
@@ -10789,7 +10481,7 @@
               <w:rPr>
                 <w:sz w:val="18"/>
               </w:rPr>
-              <w:t>Dr. Kingsy Grace R</w:t>
+              <w:t>Dr. Amrit Agarwal</w:t>
             </w:r>
           </w:p>
         </w:tc>
@@ -10803,7 +10495,7 @@
               <w:rPr>
                 <w:sz w:val="18"/>
               </w:rPr>
-              <w:t>India</w:t>
+              <w:t>Technical Program Chair · Associate Professor</w:t>
             </w:r>
           </w:p>
         </w:tc>
@@ -10817,139 +10509,7 @@
               <w:rPr>
                 <w:sz w:val="18"/>
               </w:rPr>
-              <w:t>Sri Ramakrishna Engineering College</w:t>
-            </w:r>
-          </w:p>
-        </w:tc>
-      </w:tr>
-      <w:tr>
-        <w:tc>
-          <w:tcPr>
-            <w:tcW w:type="dxa" w:w="2736"/>
-          </w:tcPr>
-          <w:p>
-            <w:r/>
-            <w:r>
-              <w:rPr>
-                <w:sz w:val="18"/>
-              </w:rPr>
-              <w:t>Dr. Manvi Breja</w:t>
-            </w:r>
-          </w:p>
-        </w:tc>
-        <w:tc>
-          <w:tcPr>
-            <w:tcW w:type="dxa" w:w="2016"/>
-          </w:tcPr>
-          <w:p>
-            <w:r/>
-            <w:r>
-              <w:rPr>
-                <w:sz w:val="18"/>
-              </w:rPr>
-              <w:t>India</w:t>
-            </w:r>
-          </w:p>
-        </w:tc>
-        <w:tc>
-          <w:tcPr>
-            <w:tcW w:type="dxa" w:w="4752"/>
-          </w:tcPr>
-          <w:p>
-            <w:r/>
-            <w:r>
-              <w:rPr>
-                <w:sz w:val="18"/>
-              </w:rPr>
-              <w:t>The NorthCap University, Gurugram</w:t>
-            </w:r>
-          </w:p>
-        </w:tc>
-      </w:tr>
-      <w:tr>
-        <w:tc>
-          <w:tcPr>
-            <w:tcW w:type="dxa" w:w="2736"/>
-          </w:tcPr>
-          <w:p>
-            <w:r/>
-            <w:r>
-              <w:rPr>
-                <w:sz w:val="18"/>
-              </w:rPr>
-              <w:t>Prof. Sumit Gupta</w:t>
-            </w:r>
-          </w:p>
-        </w:tc>
-        <w:tc>
-          <w:tcPr>
-            <w:tcW w:type="dxa" w:w="2016"/>
-          </w:tcPr>
-          <w:p>
-            <w:r/>
-            <w:r>
-              <w:rPr>
-                <w:sz w:val="18"/>
-              </w:rPr>
-              <w:t>India</w:t>
-            </w:r>
-          </w:p>
-        </w:tc>
-        <w:tc>
-          <w:tcPr>
-            <w:tcW w:type="dxa" w:w="4752"/>
-          </w:tcPr>
-          <w:p>
-            <w:r/>
-            <w:r>
-              <w:rPr>
-                <w:sz w:val="18"/>
-              </w:rPr>
-              <w:t>Academy of Technology</w:t>
-            </w:r>
-          </w:p>
-        </w:tc>
-      </w:tr>
-      <w:tr>
-        <w:tc>
-          <w:tcPr>
-            <w:tcW w:type="dxa" w:w="2736"/>
-          </w:tcPr>
-          <w:p>
-            <w:r/>
-            <w:r>
-              <w:rPr>
-                <w:sz w:val="18"/>
-              </w:rPr>
-              <w:t>Dr. Saroj Koul</w:t>
-            </w:r>
-          </w:p>
-        </w:tc>
-        <w:tc>
-          <w:tcPr>
-            <w:tcW w:type="dxa" w:w="2016"/>
-          </w:tcPr>
-          <w:p>
-            <w:r/>
-            <w:r>
-              <w:rPr>
-                <w:sz w:val="18"/>
-              </w:rPr>
-              <w:t>India</w:t>
-            </w:r>
-          </w:p>
-        </w:tc>
-        <w:tc>
-          <w:tcPr>
-            <w:tcW w:type="dxa" w:w="4752"/>
-          </w:tcPr>
-          <w:p>
-            <w:r/>
-            <w:r>
-              <w:rPr>
-                <w:sz w:val="18"/>
-              </w:rPr>
-              <w:t>O.P. Jindal Global University</w:t>
+              <w:t>Department of Computer Science and Engineering, SSCSE, Sharda University, Greater Noida, India</w:t>
             </w:r>
           </w:p>
         </w:tc>
@@ -10959,20 +10519,6 @@
       <w:pPr>
         <w:spacing w:after="80"/>
       </w:pPr>
-    </w:p>
-    <w:p>
-      <w:pPr>
-        <w:spacing w:before="280" w:after="100"/>
-      </w:pPr>
-      <w:r>
-        <w:rPr>
-          <w:b/>
-          <w:i w:val="0"/>
-          <w:color w:val="0A0A0A"/>
-          <w:sz w:val="27"/>
-        </w:rPr>
-        <w:t>Organizing Committee</w:t>
-      </w:r>
     </w:p>
     <w:p>
       <w:pPr>
@@ -10985,7 +10531,7 @@
           <w:color w:val="0A0A0A"/>
           <w:sz w:val="22"/>
         </w:rPr>
-        <w:t>Local Organizing Chairs</w:t>
+        <w:t>Technical Program Committee members</w:t>
       </w:r>
     </w:p>
     <w:tbl>
@@ -11030,7 +10576,7 @@
                 <w:color w:val="FFFFFF"/>
                 <w:sz w:val="18"/>
               </w:rPr>
-              <w:t>Role</w:t>
+              <w:t>Country</w:t>
             </w:r>
           </w:p>
         </w:tc>
@@ -11063,7 +10609,7 @@
               <w:rPr>
                 <w:sz w:val="18"/>
               </w:rPr>
-              <w:t>Dr. Bal Krishna Saraswat</w:t>
+              <w:t>Ekta Maini</w:t>
             </w:r>
           </w:p>
         </w:tc>
@@ -11077,7 +10623,7 @@
               <w:rPr>
                 <w:sz w:val="18"/>
               </w:rPr>
-              <w:t>Associate Professor</w:t>
+              <w:t>India</w:t>
             </w:r>
           </w:p>
         </w:tc>
@@ -11091,7 +10637,7 @@
               <w:rPr>
                 <w:sz w:val="18"/>
               </w:rPr>
-              <w:t>Department of Computer Science and Engineering, SSCSE, Sharda University, Greater Noida, India</w:t>
+              <w:t>Amity University Hyderabad</w:t>
             </w:r>
           </w:p>
         </w:tc>
@@ -11107,7 +10653,7 @@
               <w:rPr>
                 <w:sz w:val="18"/>
               </w:rPr>
-              <w:t>Dr. Amit Sharma</w:t>
+              <w:t>Prof. Anuja Arora</w:t>
             </w:r>
           </w:p>
         </w:tc>
@@ -11121,7 +10667,7 @@
               <w:rPr>
                 <w:sz w:val="18"/>
               </w:rPr>
-              <w:t>Assistant Professor</w:t>
+              <w:t>India</w:t>
             </w:r>
           </w:p>
         </w:tc>
@@ -11135,7 +10681,7 @@
               <w:rPr>
                 <w:sz w:val="18"/>
               </w:rPr>
-              <w:t>Department of Computer Science and Engineering, SSCSE, Sharda University, Greater Noida, India</w:t>
+              <w:t>Jaypee Institute of Information Technology</w:t>
             </w:r>
           </w:p>
         </w:tc>
@@ -11151,7 +10697,7 @@
               <w:rPr>
                 <w:sz w:val="18"/>
               </w:rPr>
-              <w:t>Dr. Renu Mishra</w:t>
+              <w:t>Sannasi Chakravarthy S R</w:t>
             </w:r>
           </w:p>
         </w:tc>
@@ -11165,7 +10711,7 @@
               <w:rPr>
                 <w:sz w:val="18"/>
               </w:rPr>
-              <w:t>Associate Professor</w:t>
+              <w:t>India</w:t>
             </w:r>
           </w:p>
         </w:tc>
@@ -11179,7 +10725,7 @@
               <w:rPr>
                 <w:sz w:val="18"/>
               </w:rPr>
-              <w:t>Department of Computer Science and Engineering, SSCSE, Sharda University, Greater Noida, India</w:t>
+              <w:t>Bannari Amman Institute of Technology</w:t>
             </w:r>
           </w:p>
         </w:tc>
@@ -11195,7 +10741,7 @@
               <w:rPr>
                 <w:sz w:val="18"/>
               </w:rPr>
-              <w:t>Dr. Amit Seth</w:t>
+              <w:t>Dr. R. Manikandan</w:t>
             </w:r>
           </w:p>
         </w:tc>
@@ -11209,7 +10755,7 @@
               <w:rPr>
                 <w:sz w:val="18"/>
               </w:rPr>
-              <w:t>Associate Professor</w:t>
+              <w:t>India</w:t>
             </w:r>
           </w:p>
         </w:tc>
@@ -11223,7 +10769,7 @@
               <w:rPr>
                 <w:sz w:val="18"/>
               </w:rPr>
-              <w:t>Department of Computer Science and Engineering, SSCSE, Sharda University, Greater Noida, India</w:t>
+              <w:t>School of Computing, SASTRA Deemed University</w:t>
             </w:r>
           </w:p>
         </w:tc>
@@ -11239,7 +10785,7 @@
               <w:rPr>
                 <w:sz w:val="18"/>
               </w:rPr>
-              <w:t>Dr. K. Lakshmi</w:t>
+              <w:t>Dr. Avijit Kumar Chaudhuri</w:t>
             </w:r>
           </w:p>
         </w:tc>
@@ -11253,7 +10799,7 @@
               <w:rPr>
                 <w:sz w:val="18"/>
               </w:rPr>
-              <w:t>Assistant Professor</w:t>
+              <w:t>India</w:t>
             </w:r>
           </w:p>
         </w:tc>
@@ -11267,7 +10813,7 @@
               <w:rPr>
                 <w:sz w:val="18"/>
               </w:rPr>
-              <w:t>Department of Computer Science and Engineering, SSCSE, Sharda University, Greater Noida, India</w:t>
+              <w:t>Brainware University</w:t>
             </w:r>
           </w:p>
         </w:tc>
@@ -11283,7 +10829,7 @@
               <w:rPr>
                 <w:sz w:val="18"/>
               </w:rPr>
-              <w:t>Dr. Velayudham</w:t>
+              <w:t>Dr. Nishant Doshi</w:t>
             </w:r>
           </w:p>
         </w:tc>
@@ -11297,7 +10843,7 @@
               <w:rPr>
                 <w:sz w:val="18"/>
               </w:rPr>
-              <w:t>Professor</w:t>
+              <w:t>India</w:t>
             </w:r>
           </w:p>
         </w:tc>
@@ -11311,7 +10857,7 @@
               <w:rPr>
                 <w:sz w:val="18"/>
               </w:rPr>
-              <w:t>Department of Computer Science and Engineering, SSCSE, Sharda University, Greater Noida, India</w:t>
+              <w:t>Pandit Deendayal Energy University (PDEU), Gandhinagar</w:t>
             </w:r>
           </w:p>
         </w:tc>
@@ -11327,7 +10873,7 @@
               <w:rPr>
                 <w:sz w:val="18"/>
               </w:rPr>
-              <w:t>Mr. Ashish Kumar</w:t>
+              <w:t>Janmenjoy Nayak</w:t>
             </w:r>
           </w:p>
         </w:tc>
@@ -11341,7 +10887,7 @@
               <w:rPr>
                 <w:sz w:val="18"/>
               </w:rPr>
-              <w:t>Assistant Professor</w:t>
+              <w:t>India</w:t>
             </w:r>
           </w:p>
         </w:tc>
@@ -11355,7 +10901,7 @@
               <w:rPr>
                 <w:sz w:val="18"/>
               </w:rPr>
-              <w:t>Department of Computer Science and Engineering, SSCSE, Sharda University, Greater Noida, India</w:t>
+              <w:t>MSCB University, Odisha</w:t>
             </w:r>
           </w:p>
         </w:tc>
@@ -11371,7 +10917,7 @@
               <w:rPr>
                 <w:sz w:val="18"/>
               </w:rPr>
-              <w:t>Dr. Gouri Sankar</w:t>
+              <w:t>Dr. Kingsy Grace R</w:t>
             </w:r>
           </w:p>
         </w:tc>
@@ -11385,7 +10931,7 @@
               <w:rPr>
                 <w:sz w:val="18"/>
               </w:rPr>
-              <w:t>Professor</w:t>
+              <w:t>India</w:t>
             </w:r>
           </w:p>
         </w:tc>
@@ -11399,7 +10945,139 @@
               <w:rPr>
                 <w:sz w:val="18"/>
               </w:rPr>
-              <w:t>Department of Computer Science and Engineering, SSCSE, Sharda University, Greater Noida, India</w:t>
+              <w:t>Sri Ramakrishna Engineering College</w:t>
+            </w:r>
+          </w:p>
+        </w:tc>
+      </w:tr>
+      <w:tr>
+        <w:tc>
+          <w:tcPr>
+            <w:tcW w:type="dxa" w:w="2736"/>
+          </w:tcPr>
+          <w:p>
+            <w:r/>
+            <w:r>
+              <w:rPr>
+                <w:sz w:val="18"/>
+              </w:rPr>
+              <w:t>Dr. Manvi Breja</w:t>
+            </w:r>
+          </w:p>
+        </w:tc>
+        <w:tc>
+          <w:tcPr>
+            <w:tcW w:type="dxa" w:w="2016"/>
+          </w:tcPr>
+          <w:p>
+            <w:r/>
+            <w:r>
+              <w:rPr>
+                <w:sz w:val="18"/>
+              </w:rPr>
+              <w:t>India</w:t>
+            </w:r>
+          </w:p>
+        </w:tc>
+        <w:tc>
+          <w:tcPr>
+            <w:tcW w:type="dxa" w:w="4752"/>
+          </w:tcPr>
+          <w:p>
+            <w:r/>
+            <w:r>
+              <w:rPr>
+                <w:sz w:val="18"/>
+              </w:rPr>
+              <w:t>The NorthCap University, Gurugram</w:t>
+            </w:r>
+          </w:p>
+        </w:tc>
+      </w:tr>
+      <w:tr>
+        <w:tc>
+          <w:tcPr>
+            <w:tcW w:type="dxa" w:w="2736"/>
+          </w:tcPr>
+          <w:p>
+            <w:r/>
+            <w:r>
+              <w:rPr>
+                <w:sz w:val="18"/>
+              </w:rPr>
+              <w:t>Prof. Sumit Gupta</w:t>
+            </w:r>
+          </w:p>
+        </w:tc>
+        <w:tc>
+          <w:tcPr>
+            <w:tcW w:type="dxa" w:w="2016"/>
+          </w:tcPr>
+          <w:p>
+            <w:r/>
+            <w:r>
+              <w:rPr>
+                <w:sz w:val="18"/>
+              </w:rPr>
+              <w:t>India</w:t>
+            </w:r>
+          </w:p>
+        </w:tc>
+        <w:tc>
+          <w:tcPr>
+            <w:tcW w:type="dxa" w:w="4752"/>
+          </w:tcPr>
+          <w:p>
+            <w:r/>
+            <w:r>
+              <w:rPr>
+                <w:sz w:val="18"/>
+              </w:rPr>
+              <w:t>Academy of Technology</w:t>
+            </w:r>
+          </w:p>
+        </w:tc>
+      </w:tr>
+      <w:tr>
+        <w:tc>
+          <w:tcPr>
+            <w:tcW w:type="dxa" w:w="2736"/>
+          </w:tcPr>
+          <w:p>
+            <w:r/>
+            <w:r>
+              <w:rPr>
+                <w:sz w:val="18"/>
+              </w:rPr>
+              <w:t>Dr. Saroj Koul</w:t>
+            </w:r>
+          </w:p>
+        </w:tc>
+        <w:tc>
+          <w:tcPr>
+            <w:tcW w:type="dxa" w:w="2016"/>
+          </w:tcPr>
+          <w:p>
+            <w:r/>
+            <w:r>
+              <w:rPr>
+                <w:sz w:val="18"/>
+              </w:rPr>
+              <w:t>India</w:t>
+            </w:r>
+          </w:p>
+        </w:tc>
+        <w:tc>
+          <w:tcPr>
+            <w:tcW w:type="dxa" w:w="4752"/>
+          </w:tcPr>
+          <w:p>
+            <w:r/>
+            <w:r>
+              <w:rPr>
+                <w:sz w:val="18"/>
+              </w:rPr>
+              <w:t>O.P. Jindal Global University</w:t>
             </w:r>
           </w:p>
         </w:tc>
@@ -11409,6 +11087,20 @@
       <w:pPr>
         <w:spacing w:after="80"/>
       </w:pPr>
+    </w:p>
+    <w:p>
+      <w:pPr>
+        <w:spacing w:before="280" w:after="100"/>
+      </w:pPr>
+      <w:r>
+        <w:rPr>
+          <w:b/>
+          <w:i w:val="0"/>
+          <w:color w:val="0A0A0A"/>
+          <w:sz w:val="27"/>
+        </w:rPr>
+        <w:t>Organizing Committee</w:t>
+      </w:r>
     </w:p>
     <w:p>
       <w:pPr>
@@ -11421,7 +11113,7 @@
           <w:color w:val="0A0A0A"/>
           <w:sz w:val="22"/>
         </w:rPr>
-        <w:t>Publicity Chairs</w:t>
+        <w:t>Local Organizing Chairs</w:t>
       </w:r>
     </w:p>
     <w:tbl>
@@ -11499,7 +11191,7 @@
               <w:rPr>
                 <w:sz w:val="18"/>
               </w:rPr>
-              <w:t>Prof. Dr. Ambuj Agarwal</w:t>
+              <w:t>Dr. Bal Krishna Saraswat</w:t>
             </w:r>
           </w:p>
         </w:tc>
@@ -11513,7 +11205,7 @@
               <w:rPr>
                 <w:sz w:val="18"/>
               </w:rPr>
-              <w:t>Professor</w:t>
+              <w:t>Associate Professor</w:t>
             </w:r>
           </w:p>
         </w:tc>
@@ -11543,7 +11235,7 @@
               <w:rPr>
                 <w:sz w:val="18"/>
               </w:rPr>
-              <w:t>Dr. Avinash Kumar Sharma</w:t>
+              <w:t>Dr. Amit Sharma</w:t>
             </w:r>
           </w:p>
         </w:tc>
@@ -11557,7 +11249,7 @@
               <w:rPr>
                 <w:sz w:val="18"/>
               </w:rPr>
-              <w:t>Associate Professor</w:t>
+              <w:t>Assistant Professor</w:t>
             </w:r>
           </w:p>
         </w:tc>
@@ -11587,7 +11279,7 @@
               <w:rPr>
                 <w:sz w:val="18"/>
               </w:rPr>
-              <w:t>Dr. Y. Sucharitha</w:t>
+              <w:t>Dr. Renu Mishra</w:t>
             </w:r>
           </w:p>
         </w:tc>
@@ -11602,6 +11294,226 @@
                 <w:sz w:val="18"/>
               </w:rPr>
               <w:t>Associate Professor</w:t>
+            </w:r>
+          </w:p>
+        </w:tc>
+        <w:tc>
+          <w:tcPr>
+            <w:tcW w:type="dxa" w:w="4752"/>
+          </w:tcPr>
+          <w:p>
+            <w:r/>
+            <w:r>
+              <w:rPr>
+                <w:sz w:val="18"/>
+              </w:rPr>
+              <w:t>Department of Computer Science and Engineering, SSCSE, Sharda University, Greater Noida, India</w:t>
+            </w:r>
+          </w:p>
+        </w:tc>
+      </w:tr>
+      <w:tr>
+        <w:tc>
+          <w:tcPr>
+            <w:tcW w:type="dxa" w:w="2736"/>
+          </w:tcPr>
+          <w:p>
+            <w:r/>
+            <w:r>
+              <w:rPr>
+                <w:sz w:val="18"/>
+              </w:rPr>
+              <w:t>Dr. Amit Seth</w:t>
+            </w:r>
+          </w:p>
+        </w:tc>
+        <w:tc>
+          <w:tcPr>
+            <w:tcW w:type="dxa" w:w="2016"/>
+          </w:tcPr>
+          <w:p>
+            <w:r/>
+            <w:r>
+              <w:rPr>
+                <w:sz w:val="18"/>
+              </w:rPr>
+              <w:t>Associate Professor</w:t>
+            </w:r>
+          </w:p>
+        </w:tc>
+        <w:tc>
+          <w:tcPr>
+            <w:tcW w:type="dxa" w:w="4752"/>
+          </w:tcPr>
+          <w:p>
+            <w:r/>
+            <w:r>
+              <w:rPr>
+                <w:sz w:val="18"/>
+              </w:rPr>
+              <w:t>Department of Computer Science and Engineering, SSCSE, Sharda University, Greater Noida, India</w:t>
+            </w:r>
+          </w:p>
+        </w:tc>
+      </w:tr>
+      <w:tr>
+        <w:tc>
+          <w:tcPr>
+            <w:tcW w:type="dxa" w:w="2736"/>
+          </w:tcPr>
+          <w:p>
+            <w:r/>
+            <w:r>
+              <w:rPr>
+                <w:sz w:val="18"/>
+              </w:rPr>
+              <w:t>Dr. K. Lakshmi</w:t>
+            </w:r>
+          </w:p>
+        </w:tc>
+        <w:tc>
+          <w:tcPr>
+            <w:tcW w:type="dxa" w:w="2016"/>
+          </w:tcPr>
+          <w:p>
+            <w:r/>
+            <w:r>
+              <w:rPr>
+                <w:sz w:val="18"/>
+              </w:rPr>
+              <w:t>Assistant Professor</w:t>
+            </w:r>
+          </w:p>
+        </w:tc>
+        <w:tc>
+          <w:tcPr>
+            <w:tcW w:type="dxa" w:w="4752"/>
+          </w:tcPr>
+          <w:p>
+            <w:r/>
+            <w:r>
+              <w:rPr>
+                <w:sz w:val="18"/>
+              </w:rPr>
+              <w:t>Department of Computer Science and Engineering, SSCSE, Sharda University, Greater Noida, India</w:t>
+            </w:r>
+          </w:p>
+        </w:tc>
+      </w:tr>
+      <w:tr>
+        <w:tc>
+          <w:tcPr>
+            <w:tcW w:type="dxa" w:w="2736"/>
+          </w:tcPr>
+          <w:p>
+            <w:r/>
+            <w:r>
+              <w:rPr>
+                <w:sz w:val="18"/>
+              </w:rPr>
+              <w:t>Dr. Velayudham</w:t>
+            </w:r>
+          </w:p>
+        </w:tc>
+        <w:tc>
+          <w:tcPr>
+            <w:tcW w:type="dxa" w:w="2016"/>
+          </w:tcPr>
+          <w:p>
+            <w:r/>
+            <w:r>
+              <w:rPr>
+                <w:sz w:val="18"/>
+              </w:rPr>
+              <w:t>Professor</w:t>
+            </w:r>
+          </w:p>
+        </w:tc>
+        <w:tc>
+          <w:tcPr>
+            <w:tcW w:type="dxa" w:w="4752"/>
+          </w:tcPr>
+          <w:p>
+            <w:r/>
+            <w:r>
+              <w:rPr>
+                <w:sz w:val="18"/>
+              </w:rPr>
+              <w:t>Department of Computer Science and Engineering, SSCSE, Sharda University, Greater Noida, India</w:t>
+            </w:r>
+          </w:p>
+        </w:tc>
+      </w:tr>
+      <w:tr>
+        <w:tc>
+          <w:tcPr>
+            <w:tcW w:type="dxa" w:w="2736"/>
+          </w:tcPr>
+          <w:p>
+            <w:r/>
+            <w:r>
+              <w:rPr>
+                <w:sz w:val="18"/>
+              </w:rPr>
+              <w:t>Mr. Ashish Kumar</w:t>
+            </w:r>
+          </w:p>
+        </w:tc>
+        <w:tc>
+          <w:tcPr>
+            <w:tcW w:type="dxa" w:w="2016"/>
+          </w:tcPr>
+          <w:p>
+            <w:r/>
+            <w:r>
+              <w:rPr>
+                <w:sz w:val="18"/>
+              </w:rPr>
+              <w:t>Assistant Professor</w:t>
+            </w:r>
+          </w:p>
+        </w:tc>
+        <w:tc>
+          <w:tcPr>
+            <w:tcW w:type="dxa" w:w="4752"/>
+          </w:tcPr>
+          <w:p>
+            <w:r/>
+            <w:r>
+              <w:rPr>
+                <w:sz w:val="18"/>
+              </w:rPr>
+              <w:t>Department of Computer Science and Engineering, SSCSE, Sharda University, Greater Noida, India</w:t>
+            </w:r>
+          </w:p>
+        </w:tc>
+      </w:tr>
+      <w:tr>
+        <w:tc>
+          <w:tcPr>
+            <w:tcW w:type="dxa" w:w="2736"/>
+          </w:tcPr>
+          <w:p>
+            <w:r/>
+            <w:r>
+              <w:rPr>
+                <w:sz w:val="18"/>
+              </w:rPr>
+              <w:t>Dr. Gouri Sankar</w:t>
+            </w:r>
+          </w:p>
+        </w:tc>
+        <w:tc>
+          <w:tcPr>
+            <w:tcW w:type="dxa" w:w="2016"/>
+          </w:tcPr>
+          <w:p>
+            <w:r/>
+            <w:r>
+              <w:rPr>
+                <w:sz w:val="18"/>
+              </w:rPr>
+              <w:t>Professor</w:t>
             </w:r>
           </w:p>
         </w:tc>
@@ -11637,7 +11549,7 @@
           <w:color w:val="0A0A0A"/>
           <w:sz w:val="22"/>
         </w:rPr>
-        <w:t>Publicity Committee</w:t>
+        <w:t>Publicity Chairs</w:t>
       </w:r>
     </w:p>
     <w:tbl>
@@ -11715,7 +11627,7 @@
               <w:rPr>
                 <w:sz w:val="18"/>
               </w:rPr>
-              <w:t>Dr. Jyoti Gautam</w:t>
+              <w:t>Prof. Dr. Ambuj Agarwal</w:t>
             </w:r>
           </w:p>
         </w:tc>
@@ -11729,7 +11641,7 @@
               <w:rPr>
                 <w:sz w:val="18"/>
               </w:rPr>
-              <w:t>Associate Professor</w:t>
+              <w:t>Professor</w:t>
             </w:r>
           </w:p>
         </w:tc>
@@ -11759,7 +11671,7 @@
               <w:rPr>
                 <w:sz w:val="18"/>
               </w:rPr>
-              <w:t>Dr. Shivam Tiwari</w:t>
+              <w:t>Dr. Avinash Kumar Sharma</w:t>
             </w:r>
           </w:p>
         </w:tc>
@@ -11773,7 +11685,7 @@
               <w:rPr>
                 <w:sz w:val="18"/>
               </w:rPr>
-              <w:t>Assistant Professor</w:t>
+              <w:t>Associate Professor</w:t>
             </w:r>
           </w:p>
         </w:tc>
@@ -11803,7 +11715,7 @@
               <w:rPr>
                 <w:sz w:val="18"/>
               </w:rPr>
-              <w:t>Dr. Manmohan Yadav</w:t>
+              <w:t>Dr. Y. Sucharitha</w:t>
             </w:r>
           </w:p>
         </w:tc>
@@ -11853,7 +11765,7 @@
           <w:color w:val="0A0A0A"/>
           <w:sz w:val="22"/>
         </w:rPr>
-        <w:t>Programme Chairs</w:t>
+        <w:t>Publicity Committee</w:t>
       </w:r>
     </w:p>
     <w:tbl>
@@ -11931,7 +11843,7 @@
               <w:rPr>
                 <w:sz w:val="18"/>
               </w:rPr>
-              <w:t>Dr. Geetha Ganesan</w:t>
+              <w:t>Dr. Jyoti Gautam</w:t>
             </w:r>
           </w:p>
         </w:tc>
@@ -11945,7 +11857,7 @@
               <w:rPr>
                 <w:sz w:val="18"/>
               </w:rPr>
-              <w:t>Programme Chair · Dean</w:t>
+              <w:t>Associate Professor</w:t>
             </w:r>
           </w:p>
         </w:tc>
@@ -11959,7 +11871,179 @@
               <w:rPr>
                 <w:sz w:val="18"/>
               </w:rPr>
-              <w:t>School of Computing Science and Engineering, Sharda University, Greater Noida, India</w:t>
+              <w:t>Department of Computer Science and Engineering, SSCSE, Sharda University, Greater Noida, India</w:t>
+            </w:r>
+          </w:p>
+        </w:tc>
+      </w:tr>
+      <w:tr>
+        <w:tc>
+          <w:tcPr>
+            <w:tcW w:type="dxa" w:w="2736"/>
+          </w:tcPr>
+          <w:p>
+            <w:r/>
+            <w:r>
+              <w:rPr>
+                <w:sz w:val="18"/>
+              </w:rPr>
+              <w:t>Dr. Shivam Tiwari</w:t>
+            </w:r>
+          </w:p>
+        </w:tc>
+        <w:tc>
+          <w:tcPr>
+            <w:tcW w:type="dxa" w:w="2016"/>
+          </w:tcPr>
+          <w:p>
+            <w:r/>
+            <w:r>
+              <w:rPr>
+                <w:sz w:val="18"/>
+              </w:rPr>
+              <w:t>Assistant Professor</w:t>
+            </w:r>
+          </w:p>
+        </w:tc>
+        <w:tc>
+          <w:tcPr>
+            <w:tcW w:type="dxa" w:w="4752"/>
+          </w:tcPr>
+          <w:p>
+            <w:r/>
+            <w:r>
+              <w:rPr>
+                <w:sz w:val="18"/>
+              </w:rPr>
+              <w:t>Department of Computer Science and Engineering, SSCSE, Sharda University, Greater Noida, India</w:t>
+            </w:r>
+          </w:p>
+        </w:tc>
+      </w:tr>
+      <w:tr>
+        <w:tc>
+          <w:tcPr>
+            <w:tcW w:type="dxa" w:w="2736"/>
+          </w:tcPr>
+          <w:p>
+            <w:r/>
+            <w:r>
+              <w:rPr>
+                <w:sz w:val="18"/>
+              </w:rPr>
+              <w:t>Dr. Manmohan Yadav</w:t>
+            </w:r>
+          </w:p>
+        </w:tc>
+        <w:tc>
+          <w:tcPr>
+            <w:tcW w:type="dxa" w:w="2016"/>
+          </w:tcPr>
+          <w:p>
+            <w:r/>
+            <w:r>
+              <w:rPr>
+                <w:sz w:val="18"/>
+              </w:rPr>
+              <w:t>Associate Professor</w:t>
+            </w:r>
+          </w:p>
+        </w:tc>
+        <w:tc>
+          <w:tcPr>
+            <w:tcW w:type="dxa" w:w="4752"/>
+          </w:tcPr>
+          <w:p>
+            <w:r/>
+            <w:r>
+              <w:rPr>
+                <w:sz w:val="18"/>
+              </w:rPr>
+              <w:t>Department of Computer Science and Engineering, SSCSE, Sharda University, Greater Noida, India</w:t>
+            </w:r>
+          </w:p>
+        </w:tc>
+      </w:tr>
+    </w:tbl>
+    <w:p>
+      <w:pPr>
+        <w:spacing w:after="80"/>
+      </w:pPr>
+    </w:p>
+    <w:p>
+      <w:pPr>
+        <w:spacing w:before="200" w:after="60"/>
+      </w:pPr>
+      <w:r>
+        <w:rPr>
+          <w:b/>
+          <w:i w:val="0"/>
+          <w:color w:val="0A0A0A"/>
+          <w:sz w:val="22"/>
+        </w:rPr>
+        <w:t>Programme Chairs</w:t>
+      </w:r>
+    </w:p>
+    <w:tbl>
+      <w:tblPr>
+        <w:tblStyle w:val="TableGrid"/>
+        <w:tblW w:type="auto" w:w="0"/>
+        <w:tblLook w:firstColumn="1" w:firstRow="1" w:lastColumn="0" w:lastRow="0" w:noHBand="0" w:noVBand="1" w:val="04A0"/>
+      </w:tblPr>
+      <w:tblGrid>
+        <w:gridCol w:w="3216"/>
+        <w:gridCol w:w="3216"/>
+        <w:gridCol w:w="3216"/>
+      </w:tblGrid>
+      <w:tr>
+        <w:tc>
+          <w:tcPr>
+            <w:tcW w:type="dxa" w:w="2736"/>
+            <w:shd w:fill="0A0A0A"/>
+          </w:tcPr>
+          <w:p>
+            <w:r/>
+            <w:r>
+              <w:rPr>
+                <w:b/>
+                <w:color w:val="FFFFFF"/>
+                <w:sz w:val="18"/>
+              </w:rPr>
+              <w:t>Name</w:t>
+            </w:r>
+          </w:p>
+        </w:tc>
+        <w:tc>
+          <w:tcPr>
+            <w:tcW w:type="dxa" w:w="2016"/>
+            <w:shd w:fill="0A0A0A"/>
+          </w:tcPr>
+          <w:p>
+            <w:r/>
+            <w:r>
+              <w:rPr>
+                <w:b/>
+                <w:color w:val="FFFFFF"/>
+                <w:sz w:val="18"/>
+              </w:rPr>
+              <w:t>Role</w:t>
+            </w:r>
+          </w:p>
+        </w:tc>
+        <w:tc>
+          <w:tcPr>
+            <w:tcW w:type="dxa" w:w="4752"/>
+            <w:shd w:fill="0A0A0A"/>
+          </w:tcPr>
+          <w:p>
+            <w:r/>
+            <w:r>
+              <w:rPr>
+                <w:b/>
+                <w:color w:val="FFFFFF"/>
+                <w:sz w:val="18"/>
+              </w:rPr>
+              <w:t>Affiliation</w:t>
             </w:r>
           </w:p>
         </w:tc>

</xml_diff>

<commit_message>
Update Sharda University host institution section
Rewrite the Sharda University profile to emphasize the institution's vision
for becoming one of India's leading universities with excellence in research
and teaching. Highlight outstanding faculty, world-class standards, and
innovative programmes. Add explicit mention of industry and academia technical
sponsorship of ICNGCI 2027.

Co-Authored-By: Claude Haiku 4.5 <noreply@anthropic.com>
</commit_message>
<xml_diff>
--- a/assets/downloads/ICNGCI-2027-Conference-Information.docx
+++ b/assets/downloads/ICNGCI-2027-Conference-Information.docx
@@ -441,7 +441,7 @@
           <w:i w:val="0"/>
           <w:sz w:val="21"/>
         </w:rPr>
-        <w:t>ICNGCI exists to close the distance between computing research and the problems it is meant to solve — gathering researchers, doctoral scholars, engineers and industry experts to present original work and stress-test ideas in open discussion.</w:t>
+        <w:t>Building on the success of the International Conference on Trustworthy Digital Networks (ICCTDN 2026), which was technically sponsored by industries and academia through various technical and humanitarian activities, ICNGCI 2027 continues this tradition of bringing together researchers, scholars, engineers and industry experts.</w:t>
       </w:r>
     </w:p>
     <w:p>
@@ -454,33 +454,7 @@
           <w:i w:val="0"/>
           <w:sz w:val="21"/>
         </w:rPr>
-        <w:t>Six tracks cover ninety topic areas, from the foundations of machine learning and post-quantum cryptography to satellite networking, digital twins and technology governance. Work that sits deliberately between tracks is equally welcome.</w:t>
-      </w:r>
-    </w:p>
-    <w:p>
-      <w:pPr>
-        <w:spacing w:before="0" w:after="120"/>
-      </w:pPr>
-      <w:r>
-        <w:rPr>
-          <w:b w:val="0"/>
-          <w:i w:val="0"/>
-          <w:sz w:val="21"/>
-        </w:rPr>
-        <w:t>Every submission receives at least three independent double-blind reviews from a standing panel of over 260 reviewers. Accepted papers are presented alongside plenary keynotes, industry talks, a doctoral symposium, tutorials and a poster session, with best paper, best student paper and best presentation awards in each track.</w:t>
-      </w:r>
-    </w:p>
-    <w:p>
-      <w:pPr>
-        <w:spacing w:before="0" w:after="120"/>
-      </w:pPr>
-      <w:r>
-        <w:rPr>
-          <w:b w:val="0"/>
-          <w:i w:val="0"/>
-          <w:sz w:val="21"/>
-        </w:rPr>
-        <w:t>The conference runs in hybrid mode — authors who cannot travel present remotely under the same review standard, with no difference in how their paper is treated.</w:t>
+        <w:t>The conference is technically sponsored by industries and academia through various technical and humanitarian activities, fostering collaboration and innovation across institutional and sectoral boundaries.</w:t>
       </w:r>
     </w:p>
     <w:p>
@@ -1013,7 +987,7 @@
           <w:i w:val="0"/>
           <w:sz w:val="21"/>
         </w:rPr>
-        <w:t>Sharda University is a leading educational institution based at Greater Noida (NCR-Delhi), India — a venture of the Sharda Group of Institutions.</w:t>
+        <w:t>Sharda University is a leading educational institution based at Greater Noida (NCR-Delhi), India, a venture of the renowned Sharda Group of Institutions (SGI).</w:t>
       </w:r>
     </w:p>
     <w:p>
@@ -1026,7 +1000,7 @@
           <w:i w:val="0"/>
           <w:sz w:val="21"/>
         </w:rPr>
-        <w:t>The University has established itself as a high-quality education provider with a prime focus on holistic learning and on building competitive ability in its students. It is approved by the University Grants Commission and is the only multi-discipline campus in the National Capital Region, spread over 63 acres and equipped with world-class facilities.</w:t>
+        <w:t>The University has established itself as a high-quality education provider with a prime focus on holistic learning and developing competitive abilities in its students. Approved by the University Grants Commission (UGC), Sharda University is the only multi-discipline campus in the National Capital Region, spread over 63 acres and equipped with world-class facilities.</w:t>
       </w:r>
     </w:p>
     <w:p>
@@ -1039,7 +1013,7 @@
           <w:i w:val="0"/>
           <w:sz w:val="21"/>
         </w:rPr>
-        <w:t>Sharda University has been accredited by the National Assessment and Accreditation Council (NAAC) with an A+ grade , and was ranked 87th in the University category in the NIRF 2023 Rankings. The campus hosts students from more than 95 countries alongside Sharda Hospital, a 1,600-bed multi-speciality teaching hospital.</w:t>
+        <w:t>Sharda University has been accredited by the National Assessment and Accreditation Council (NAAC) with an A+ grade and is ranked 87th in the University category by NIRF 2023. The University is committed to becoming one of India's leading institutions with an acknowledged reputation for excellence in research and teaching, distinguished by its outstanding faculty, world-class teaching standards and innovative academic programmes.</w:t>
       </w:r>
     </w:p>
     <w:p>
@@ -1052,7 +1026,7 @@
           <w:i w:val="0"/>
           <w:sz w:val="21"/>
         </w:rPr>
-        <w:t>ICNGCI 2027 is organised by the Sharda School of Computing Science &amp; Engineering , which runs undergraduate, postgraduate and doctoral programmes across computer science, computer applications and allied disciplines, and whose faculty work in artificial intelligence, wireless and sensor networks, security, IoT and biomedical computing. The school has hosted a sustained series of international conferences with indexed proceedings.</w:t>
+        <w:t>ICNGCI 2027 is organised by the Sharda School of Computing Science &amp; Engineering and is technically sponsored by industries and academia through various technical and humanitarian activities, fostering innovation and collaboration across institutional and sectoral boundaries.</w:t>
       </w:r>
     </w:p>
     <w:p>

</xml_diff>

<commit_message>
Remove Review process and Special sessions sections from Call for Papers
Remove redundant content sections as requested.

Co-Authored-By: Claude Haiku 4.5 <noreply@anthropic.com>
</commit_message>
<xml_diff>
--- a/assets/downloads/ICNGCI-2027-Conference-Information.docx
+++ b/assets/downloads/ICNGCI-2027-Conference-Information.docx
@@ -3767,112 +3767,6 @@
           <w:sz w:val="22"/>
         </w:rPr>
         <w:t>Submission categories</w:t>
-      </w:r>
-    </w:p>
-    <w:p>
-      <w:pPr>
-        <w:spacing w:before="200" w:after="60"/>
-      </w:pPr>
-      <w:r>
-        <w:rPr>
-          <w:b/>
-          <w:i w:val="0"/>
-          <w:color w:val="0A0A0A"/>
-          <w:sz w:val="22"/>
-        </w:rPr>
-        <w:t>Review process</w:t>
-      </w:r>
-    </w:p>
-    <w:p>
-      <w:pPr>
-        <w:pStyle w:val="ListBullet"/>
-        <w:spacing w:after="60"/>
-        <w:ind w:left="360"/>
-      </w:pPr>
-      <w:r>
-        <w:rPr>
-          <w:sz w:val="21"/>
-        </w:rPr>
-        <w:t>Desk check — scope, formatting and text similarity. Papers that fail are returned without review.</w:t>
-      </w:r>
-    </w:p>
-    <w:p>
-      <w:pPr>
-        <w:pStyle w:val="ListBullet"/>
-        <w:spacing w:after="60"/>
-        <w:ind w:left="360"/>
-      </w:pPr>
-      <w:r>
-        <w:rPr>
-          <w:sz w:val="21"/>
-        </w:rPr>
-        <w:t>Assignment — at least three Technical Program Committee members with matching expertise and no conflict of interest.</w:t>
-      </w:r>
-    </w:p>
-    <w:p>
-      <w:pPr>
-        <w:pStyle w:val="ListBullet"/>
-        <w:spacing w:after="60"/>
-        <w:ind w:left="360"/>
-      </w:pPr>
-      <w:r>
-        <w:rPr>
-          <w:sz w:val="21"/>
-        </w:rPr>
-        <w:t>Double-blind review — scored on originality, technical soundness, evaluation, clarity and relevance, with written comments.</w:t>
-      </w:r>
-    </w:p>
-    <w:p>
-      <w:pPr>
-        <w:pStyle w:val="ListBullet"/>
-        <w:spacing w:after="60"/>
-        <w:ind w:left="360"/>
-      </w:pPr>
-      <w:r>
-        <w:rPr>
-          <w:sz w:val="21"/>
-        </w:rPr>
-        <w:t>Meta-review — where reviews diverge, the track chair seeks an additional review before recommending a decision.</w:t>
-      </w:r>
-    </w:p>
-    <w:p>
-      <w:pPr>
-        <w:pStyle w:val="ListBullet"/>
-        <w:spacing w:after="60"/>
-        <w:ind w:left="360"/>
-      </w:pPr>
-      <w:r>
-        <w:rPr>
-          <w:sz w:val="21"/>
-        </w:rPr>
-        <w:t>Decision — released with all reviewer comments to the corresponding author on 5 May 2027.</w:t>
-      </w:r>
-    </w:p>
-    <w:p>
-      <w:pPr>
-        <w:spacing w:before="200" w:after="60"/>
-      </w:pPr>
-      <w:r>
-        <w:rPr>
-          <w:b/>
-          <w:i w:val="0"/>
-          <w:color w:val="0A0A0A"/>
-          <w:sz w:val="22"/>
-        </w:rPr>
-        <w:t>Special sessions and tutorials</w:t>
-      </w:r>
-    </w:p>
-    <w:p>
-      <w:pPr>
-        <w:spacing w:before="0" w:after="120"/>
-      </w:pPr>
-      <w:r>
-        <w:rPr>
-          <w:b w:val="0"/>
-          <w:i w:val="0"/>
-          <w:sz w:val="21"/>
-        </w:rPr>
-        <w:t>Proposals for special sessions and for half-day tutorials are due 15 February 2027 . Send a two-page outline — title, scope, organisers' biographies and the papers expected — to papers@icngci2027.sharda.ac.in . Special-session papers pass through the same double-blind review as the main track.</w:t>
       </w:r>
     </w:p>
     <w:tbl>

</xml_diff>

<commit_message>
Add prominent Springer manuscript guidelines link
Add a highlighted note box in the submission page directing authors to
Springer's comprehensive manuscript guidelines and the PDF instructions,
styled consistently with the site design using the gold note pattern.

Co-Authored-By: Claude Haiku 4.5 <noreply@anthropic.com>
</commit_message>
<xml_diff>
--- a/assets/downloads/ICNGCI-2027-Conference-Information.docx
+++ b/assets/downloads/ICNGCI-2027-Conference-Information.docx
@@ -5174,6 +5174,19 @@
           <w:sz w:val="21"/>
         </w:rPr>
         <w:t>All references, figures, and tables should be numbered in sequence starting from 1 and MUST be duly cited / referred within the text.</w:t>
+      </w:r>
+    </w:p>
+    <w:p>
+      <w:pPr>
+        <w:spacing w:before="0" w:after="120"/>
+      </w:pPr>
+      <w:r>
+        <w:rPr>
+          <w:b w:val="0"/>
+          <w:i w:val="0"/>
+          <w:sz w:val="21"/>
+        </w:rPr>
+        <w:t>For detailed information on manuscript preparation, formatting standards, structure, abstract and keywords guidelines, reference formatting, and all Springer publishing requirements, consult the Springer manuscript guidelines or download the Springer instructions for authors PDF .</w:t>
       </w:r>
     </w:p>
     <w:p>

</xml_diff>

<commit_message>
Redesign manuscript guidelines section to match submission deadline style
Move the Springer manuscript guidelines from a note box to a prominent
cta-band section with call-to-action buttons, matching the visual prominence
of the submission deadline banner. Includes direct links to Springer guidelines
and the PDF instructions.

Co-Authored-By: Claude Haiku 4.5 <noreply@anthropic.com>
</commit_message>
<xml_diff>
--- a/assets/downloads/ICNGCI-2027-Conference-Information.docx
+++ b/assets/downloads/ICNGCI-2027-Conference-Information.docx
@@ -5178,19 +5178,6 @@
     </w:p>
     <w:p>
       <w:pPr>
-        <w:spacing w:before="0" w:after="120"/>
-      </w:pPr>
-      <w:r>
-        <w:rPr>
-          <w:b w:val="0"/>
-          <w:i w:val="0"/>
-          <w:sz w:val="21"/>
-        </w:rPr>
-        <w:t>For detailed information on manuscript preparation, formatting standards, structure, abstract and keywords guidelines, reference formatting, and all Springer publishing requirements, consult the Springer manuscript guidelines or download the Springer instructions for authors PDF .</w:t>
-      </w:r>
-    </w:p>
-    <w:p>
-      <w:pPr>
         <w:spacing w:before="200" w:after="60"/>
       </w:pPr>
       <w:r>
@@ -5253,6 +5240,33 @@
           <w:sz w:val="21"/>
         </w:rPr>
         <w:t>Hence, it is the responsibility of each author to strive for the highest ethical standards with respect to plagiarism.</w:t>
+      </w:r>
+    </w:p>
+    <w:p>
+      <w:pPr>
+        <w:spacing w:before="280" w:after="100"/>
+      </w:pPr>
+      <w:r>
+        <w:rPr>
+          <w:b/>
+          <w:i w:val="0"/>
+          <w:color w:val="0A0A0A"/>
+          <w:sz w:val="27"/>
+        </w:rPr>
+        <w:t>Comprehensive manuscript guidelines</w:t>
+      </w:r>
+    </w:p>
+    <w:p>
+      <w:pPr>
+        <w:spacing w:before="0" w:after="120"/>
+      </w:pPr>
+      <w:r>
+        <w:rPr>
+          <w:b w:val="0"/>
+          <w:i w:val="0"/>
+          <w:sz w:val="21"/>
+        </w:rPr>
+        <w:t>For detailed information on manuscript preparation, formatting standards, structure, abstract and keywords guidelines, reference formatting, and all Springer publishing requirements, consult the complete Springer guidelines.</w:t>
       </w:r>
     </w:p>
     <w:p>

</xml_diff>

<commit_message>
Move manuscript guidelines before preparation section
Reposition the comprehensive manuscript guidelines to appear before the
Manuscript Preparation checklist, styled as a highlighted box with links to
Springer guidelines and the PDF instructions.

Co-Authored-By: Claude Haiku 4.5 <noreply@anthropic.com>
</commit_message>
<xml_diff>
--- a/assets/downloads/ICNGCI-2027-Conference-Information.docx
+++ b/assets/downloads/ICNGCI-2027-Conference-Information.docx
@@ -5082,98 +5082,20 @@
           <w:color w:val="0A0A0A"/>
           <w:sz w:val="22"/>
         </w:rPr>
-        <w:t>Manuscript Preparation</w:t>
+        <w:t>Comprehensive manuscript guidelines</w:t>
       </w:r>
     </w:p>
     <w:p>
       <w:pPr>
-        <w:pStyle w:val="ListBullet"/>
-        <w:spacing w:after="60"/>
-        <w:ind w:left="360"/>
-      </w:pPr>
-      <w:r>
-        <w:rPr>
+        <w:spacing w:before="0" w:after="120"/>
+      </w:pPr>
+      <w:r>
+        <w:rPr>
+          <w:b w:val="0"/>
+          <w:i w:val="0"/>
           <w:sz w:val="21"/>
         </w:rPr>
-        <w:t>The manuscript should be prepared in springer format using MS WORD and/or LaTeX template.</w:t>
-      </w:r>
-    </w:p>
-    <w:p>
-      <w:pPr>
-        <w:pStyle w:val="ListBullet"/>
-        <w:spacing w:after="60"/>
-        <w:ind w:left="360"/>
-      </w:pPr>
-      <w:r>
-        <w:rPr>
-          <w:sz w:val="21"/>
-        </w:rPr>
-        <w:t>The figures/graphs/plots in the manuscript MUST be of good resolution (600 dpi or more), tables MUST NOT be in pictorial format. Text in figures should not be too small, and preferably of equal size as text of the article.</w:t>
-      </w:r>
-    </w:p>
-    <w:p>
-      <w:pPr>
-        <w:pStyle w:val="ListBullet"/>
-        <w:spacing w:after="60"/>
-        <w:ind w:left="360"/>
-      </w:pPr>
-      <w:r>
-        <w:rPr>
-          <w:sz w:val="21"/>
-        </w:rPr>
-        <w:t>Figures, text, or the tables MUST be visible within boundary of the text area of the page and MUST NOT go beyond it.</w:t>
-      </w:r>
-    </w:p>
-    <w:p>
-      <w:pPr>
-        <w:pStyle w:val="ListBullet"/>
-        <w:spacing w:after="60"/>
-        <w:ind w:left="360"/>
-      </w:pPr>
-      <w:r>
-        <w:rPr>
-          <w:sz w:val="21"/>
-        </w:rPr>
-        <w:t>Do NOT use any Social/Academic titles (e.g. Mr., Ms., Dr., Prof. etc) preceding the author names. Do NOT mention the position of a person (e.g., research scholar, student, assistant professor, professor etc.) in the affiliation.</w:t>
-      </w:r>
-    </w:p>
-    <w:p>
-      <w:pPr>
-        <w:pStyle w:val="ListBullet"/>
-        <w:spacing w:after="60"/>
-        <w:ind w:left="360"/>
-      </w:pPr>
-      <w:r>
-        <w:rPr>
-          <w:sz w:val="21"/>
-        </w:rPr>
-        <w:t>Mention full address, affiliation, and email of ALL authors, specify a corresponding author with the corresponding e-mail ID. [Once an article is accepted, the publisher will send the proofreading of article to this e-mail].</w:t>
-      </w:r>
-    </w:p>
-    <w:p>
-      <w:pPr>
-        <w:pStyle w:val="ListBullet"/>
-        <w:spacing w:after="60"/>
-        <w:ind w:left="360"/>
-      </w:pPr>
-      <w:r>
-        <w:rPr>
-          <w:sz w:val="21"/>
-        </w:rPr>
-        <w:t>Articles must be written in spell checked and grammatically correct English.</w:t>
-      </w:r>
-    </w:p>
-    <w:p>
-      <w:pPr>
-        <w:pStyle w:val="ListBullet"/>
-        <w:spacing w:after="60"/>
-        <w:ind w:left="360"/>
-      </w:pPr>
-      <w:r>
-        <w:rPr>
-          <w:sz w:val="21"/>
-        </w:rPr>
-        <w:t>All references, figures, and tables should be numbered in sequence starting from 1 and MUST be duly cited / referred within the text.</w:t>
+        <w:t>For detailed information on manuscript preparation, formatting standards, structure, abstract and keywords guidelines, reference formatting, and all Springer publishing requirements, consult the Springer manuscript guidelines or download the PDF .</w:t>
       </w:r>
     </w:p>
     <w:p>
@@ -5187,7 +5109,7 @@
           <w:color w:val="0A0A0A"/>
           <w:sz w:val="22"/>
         </w:rPr>
-        <w:t>Policy on Plagiarism</w:t>
+        <w:t>Manuscript Preparation</w:t>
       </w:r>
     </w:p>
     <w:p>
@@ -5200,7 +5122,7 @@
         <w:rPr>
           <w:sz w:val="21"/>
         </w:rPr>
-        <w:t>Authors are requested to kindly refrain from plagiarism in any form. Authors should submit their original and unpublished research work not under consideration for publication elsewhere.</w:t>
+        <w:t>The manuscript should be prepared in springer format using MS WORD and/or LaTeX template.</w:t>
       </w:r>
     </w:p>
     <w:p>
@@ -5213,7 +5135,7 @@
         <w:rPr>
           <w:sz w:val="21"/>
         </w:rPr>
-        <w:t>Papers found to be plagiarized during any stage of review shall be rejected.</w:t>
+        <w:t>The figures/graphs/plots in the manuscript MUST be of good resolution (600 dpi or more), tables MUST NOT be in pictorial format. Text in figures should not be too small, and preferably of equal size as text of the article.</w:t>
       </w:r>
     </w:p>
     <w:p>
@@ -5226,7 +5148,7 @@
         <w:rPr>
           <w:sz w:val="21"/>
         </w:rPr>
-        <w:t>As per copyright transfer agreement, Authors are deemed to be individually and collectively responsible for the content of manuscripts published by them.</w:t>
+        <w:t>Figures, text, or the tables MUST be visible within boundary of the text area of the page and MUST NOT go beyond it.</w:t>
       </w:r>
     </w:p>
     <w:p>
@@ -5239,34 +5161,112 @@
         <w:rPr>
           <w:sz w:val="21"/>
         </w:rPr>
-        <w:t>Hence, it is the responsibility of each author to strive for the highest ethical standards with respect to plagiarism.</w:t>
+        <w:t>Do NOT use any Social/Academic titles (e.g. Mr., Ms., Dr., Prof. etc) preceding the author names. Do NOT mention the position of a person (e.g., research scholar, student, assistant professor, professor etc.) in the affiliation.</w:t>
       </w:r>
     </w:p>
     <w:p>
       <w:pPr>
-        <w:spacing w:before="280" w:after="100"/>
+        <w:pStyle w:val="ListBullet"/>
+        <w:spacing w:after="60"/>
+        <w:ind w:left="360"/>
+      </w:pPr>
+      <w:r>
+        <w:rPr>
+          <w:sz w:val="21"/>
+        </w:rPr>
+        <w:t>Mention full address, affiliation, and email of ALL authors, specify a corresponding author with the corresponding e-mail ID. [Once an article is accepted, the publisher will send the proofreading of article to this e-mail].</w:t>
+      </w:r>
+    </w:p>
+    <w:p>
+      <w:pPr>
+        <w:pStyle w:val="ListBullet"/>
+        <w:spacing w:after="60"/>
+        <w:ind w:left="360"/>
+      </w:pPr>
+      <w:r>
+        <w:rPr>
+          <w:sz w:val="21"/>
+        </w:rPr>
+        <w:t>Articles must be written in spell checked and grammatically correct English.</w:t>
+      </w:r>
+    </w:p>
+    <w:p>
+      <w:pPr>
+        <w:pStyle w:val="ListBullet"/>
+        <w:spacing w:after="60"/>
+        <w:ind w:left="360"/>
+      </w:pPr>
+      <w:r>
+        <w:rPr>
+          <w:sz w:val="21"/>
+        </w:rPr>
+        <w:t>All references, figures, and tables should be numbered in sequence starting from 1 and MUST be duly cited / referred within the text.</w:t>
+      </w:r>
+    </w:p>
+    <w:p>
+      <w:pPr>
+        <w:spacing w:before="200" w:after="60"/>
       </w:pPr>
       <w:r>
         <w:rPr>
           <w:b/>
           <w:i w:val="0"/>
           <w:color w:val="0A0A0A"/>
-          <w:sz w:val="27"/>
-        </w:rPr>
-        <w:t>Comprehensive manuscript guidelines</w:t>
+          <w:sz w:val="22"/>
+        </w:rPr>
+        <w:t>Policy on Plagiarism</w:t>
       </w:r>
     </w:p>
     <w:p>
       <w:pPr>
-        <w:spacing w:before="0" w:after="120"/>
-      </w:pPr>
-      <w:r>
-        <w:rPr>
-          <w:b w:val="0"/>
-          <w:i w:val="0"/>
+        <w:pStyle w:val="ListBullet"/>
+        <w:spacing w:after="60"/>
+        <w:ind w:left="360"/>
+      </w:pPr>
+      <w:r>
+        <w:rPr>
           <w:sz w:val="21"/>
         </w:rPr>
-        <w:t>For detailed information on manuscript preparation, formatting standards, structure, abstract and keywords guidelines, reference formatting, and all Springer publishing requirements, consult the complete Springer guidelines.</w:t>
+        <w:t>Authors are requested to kindly refrain from plagiarism in any form. Authors should submit their original and unpublished research work not under consideration for publication elsewhere.</w:t>
+      </w:r>
+    </w:p>
+    <w:p>
+      <w:pPr>
+        <w:pStyle w:val="ListBullet"/>
+        <w:spacing w:after="60"/>
+        <w:ind w:left="360"/>
+      </w:pPr>
+      <w:r>
+        <w:rPr>
+          <w:sz w:val="21"/>
+        </w:rPr>
+        <w:t>Papers found to be plagiarized during any stage of review shall be rejected.</w:t>
+      </w:r>
+    </w:p>
+    <w:p>
+      <w:pPr>
+        <w:pStyle w:val="ListBullet"/>
+        <w:spacing w:after="60"/>
+        <w:ind w:left="360"/>
+      </w:pPr>
+      <w:r>
+        <w:rPr>
+          <w:sz w:val="21"/>
+        </w:rPr>
+        <w:t>As per copyright transfer agreement, Authors are deemed to be individually and collectively responsible for the content of manuscripts published by them.</w:t>
+      </w:r>
+    </w:p>
+    <w:p>
+      <w:pPr>
+        <w:pStyle w:val="ListBullet"/>
+        <w:spacing w:after="60"/>
+        <w:ind w:left="360"/>
+      </w:pPr>
+      <w:r>
+        <w:rPr>
+          <w:sz w:val="21"/>
+        </w:rPr>
+        <w:t>Hence, it is the responsibility of each author to strive for the highest ethical standards with respect to plagiarism.</w:t>
       </w:r>
     </w:p>
     <w:p>

</xml_diff>

<commit_message>
Highlight manuscript guidelines with the deadline banner style
Rebuild the Springer manuscript guidelines box using the .deadline
component — the same bold black banner with red accent border used for
the full paper submission deadline on the call-for-papers page — instead
of a plain tinted box, so it reads with the same weight on this page.

Co-Authored-By: Claude Sonnet 5 <noreply@anthropic.com>
</commit_message>
<xml_diff>
--- a/assets/downloads/ICNGCI-2027-Conference-Information.docx
+++ b/assets/downloads/ICNGCI-2027-Conference-Information.docx
@@ -5069,33 +5069,6 @@
           <w:sz w:val="21"/>
         </w:rPr>
         <w:t>At least one author of an accepted paper must register and present his / her paper in conference. Authors are invited to submit original papers of 8–10 pages in A4 size using the Springer template, with one accepted paper covered under standard registration.</w:t>
-      </w:r>
-    </w:p>
-    <w:p>
-      <w:pPr>
-        <w:spacing w:before="200" w:after="60"/>
-      </w:pPr>
-      <w:r>
-        <w:rPr>
-          <w:b/>
-          <w:i w:val="0"/>
-          <w:color w:val="0A0A0A"/>
-          <w:sz w:val="22"/>
-        </w:rPr>
-        <w:t>Comprehensive manuscript guidelines</w:t>
-      </w:r>
-    </w:p>
-    <w:p>
-      <w:pPr>
-        <w:spacing w:before="0" w:after="120"/>
-      </w:pPr>
-      <w:r>
-        <w:rPr>
-          <w:b w:val="0"/>
-          <w:i w:val="0"/>
-          <w:sz w:val="21"/>
-        </w:rPr>
-        <w:t>For detailed information on manuscript preparation, formatting standards, structure, abstract and keywords guidelines, reference formatting, and all Springer publishing requirements, consult the Springer manuscript guidelines or download the PDF .</w:t>
       </w:r>
     </w:p>
     <w:p>

</xml_diff>